<commit_message>
add trello to the Physics GDD
</commit_message>
<xml_diff>
--- a/Sprint 0 - Conceptfase/Physics/1_GDD_HalfLife2_Puzzlegame_StamgroepB.docx
+++ b/Sprint 0 - Conceptfase/Physics/1_GDD_HalfLife2_Puzzlegame_StamgroepB.docx
@@ -1,8 +1,8 @@
 
 <file path=word/document.xml><?xml version="1.0" encoding="utf-8"?>
-<w:document xmlns:o="urn:schemas-microsoft-com:office:office" xmlns:r="http://schemas.openxmlformats.org/officeDocument/2006/relationships" xmlns:v="urn:schemas-microsoft-com:vml" xmlns:w="http://schemas.openxmlformats.org/wordprocessingml/2006/main" xmlns:w10="urn:schemas-microsoft-com:office:word" xmlns:wp="http://schemas.openxmlformats.org/drawingml/2006/wordprocessingDrawing" xmlns:pic="http://schemas.openxmlformats.org/drawingml/2006/picture" xmlns:wps="http://schemas.microsoft.com/office/word/2010/wordprocessingShape" xmlns:wpg="http://schemas.microsoft.com/office/word/2010/wordprocessingGroup" xmlns:mc="http://schemas.openxmlformats.org/markup-compatibility/2006" xmlns:wp14="http://schemas.microsoft.com/office/word/2010/wordprocessingDrawing" xmlns:w14="http://schemas.microsoft.com/office/word/2010/wordml" xmlns:w15="http://schemas.microsoft.com/office/word/2012/wordml" mc:Ignorable="w14 wp14 w15">
+<w:document xmlns:o="urn:schemas-microsoft-com:office:office" xmlns:r="http://schemas.openxmlformats.org/officeDocument/2006/relationships" xmlns:v="urn:schemas-microsoft-com:vml" xmlns:w="http://schemas.openxmlformats.org/wordprocessingml/2006/main" xmlns:w10="urn:schemas-microsoft-com:office:word" xmlns:wp="http://schemas.openxmlformats.org/drawingml/2006/wordprocessingDrawing" xmlns:pic="http://schemas.openxmlformats.org/drawingml/2006/picture" xmlns:wps="http://schemas.microsoft.com/office/word/2010/wordprocessingShape" xmlns:wpg="http://schemas.microsoft.com/office/word/2010/wordprocessingGroup" xmlns:mc="http://schemas.openxmlformats.org/markup-compatibility/2006" xmlns:wp14="http://schemas.microsoft.com/office/word/2010/wordprocessingDrawing" xmlns:w14="http://schemas.microsoft.com/office/word/2010/wordml" xmlns:w15="http://schemas.microsoft.com/office/word/2012/wordml" xmlns:a="http://schemas.openxmlformats.org/drawingml/2006/main" xmlns:a14="http://schemas.microsoft.com/office/drawing/2010/main" mc:Ignorable="w14 wp14 w15">
   <w:body>
-    <w:p>
+    <w:p xmlns:wp14="http://schemas.microsoft.com/office/word/2010/wordml" wp14:textId="77777777">
       <w:pPr>
         <w:pStyle w:val="Normal"/>
         <w:rPr>
@@ -15,7 +15,7 @@
         </w:rPr>
       </w:r>
     </w:p>
-    <w:p>
+    <w:p xmlns:wp14="http://schemas.microsoft.com/office/word/2010/wordml" wp14:textId="77777777">
       <w:pPr>
         <w:pStyle w:val="Normal"/>
         <w:rPr>
@@ -28,7 +28,7 @@
         </w:rPr>
       </w:r>
     </w:p>
-    <w:p>
+    <w:p xmlns:wp14="http://schemas.microsoft.com/office/word/2010/wordml" wp14:textId="77777777">
       <w:pPr>
         <w:pStyle w:val="Normal"/>
         <w:spacing w:before="1560" w:after="160"/>
@@ -52,7 +52,7 @@
         <w:t>Sjabloon 1</w:t>
       </w:r>
     </w:p>
-    <w:p>
+    <w:p xmlns:wp14="http://schemas.microsoft.com/office/word/2010/wordml" wp14:textId="77777777">
       <w:pPr>
         <w:pStyle w:val="Title"/>
         <w:jc w:val="center"/>
@@ -69,7 +69,7 @@
         <w:t xml:space="preserve">Game Design Document EPOC* </w:t>
       </w:r>
     </w:p>
-    <w:p>
+    <w:p xmlns:wp14="http://schemas.microsoft.com/office/word/2010/wordml" wp14:textId="77777777">
       <w:pPr>
         <w:pStyle w:val="Title"/>
         <w:jc w:val="center"/>
@@ -88,7 +88,7 @@
         <w:t xml:space="preserve">*(electronic proof of concept) </w:t>
       </w:r>
     </w:p>
-    <w:p>
+    <w:p xmlns:wp14="http://schemas.microsoft.com/office/word/2010/wordml" wp14:textId="77777777">
       <w:pPr>
         <w:pStyle w:val="Normal"/>
         <w:rPr>
@@ -101,7 +101,7 @@
         </w:rPr>
       </w:r>
     </w:p>
-    <w:p>
+    <w:p xmlns:wp14="http://schemas.microsoft.com/office/word/2010/wordml" wp14:textId="77777777">
       <w:pPr>
         <w:pStyle w:val="Normal"/>
         <w:jc w:val="center"/>
@@ -126,7 +126,7 @@
         <w:t>B1-K1-W1</w:t>
       </w:r>
     </w:p>
-    <w:p>
+    <w:p xmlns:wp14="http://schemas.microsoft.com/office/word/2010/wordml" wp14:textId="77777777">
       <w:pPr>
         <w:pStyle w:val="Normal"/>
         <w:rPr>
@@ -139,7 +139,7 @@
         </w:rPr>
       </w:r>
     </w:p>
-    <w:p>
+    <w:p xmlns:wp14="http://schemas.microsoft.com/office/word/2010/wordml" wp14:textId="77777777">
       <w:pPr>
         <w:pStyle w:val="Normal"/>
         <w:jc w:val="center"/>
@@ -150,7 +150,7 @@
       <w:r>
         <w:rPr/>
         <w:drawing>
-          <wp:inline distT="0" distB="0" distL="0" distR="0">
+          <wp:inline xmlns:wp14="http://schemas.microsoft.com/office/word/2010/wordprocessingDrawing" distT="0" distB="0" distL="0" distR="0" wp14:anchorId="35BA40C1" wp14:editId="7777777">
             <wp:extent cx="5760720" cy="3025140"/>
             <wp:effectExtent l="0" t="0" r="0" b="0"/>
             <wp:docPr id="1" name="Afbeelding 1" descr="I created a prototype level for my souls-like genre game. The action takes  place in the castle and in its courtyard. I am currently in the process of  developing mechanics. In a"/>
@@ -190,7 +190,7 @@
         </w:drawing>
       </w:r>
     </w:p>
-    <w:p>
+    <w:p xmlns:wp14="http://schemas.microsoft.com/office/word/2010/wordml" wp14:textId="77777777">
       <w:pPr>
         <w:pStyle w:val="Normal"/>
         <w:rPr>
@@ -203,7 +203,7 @@
         </w:rPr>
       </w:r>
     </w:p>
-    <w:p>
+    <w:p xmlns:wp14="http://schemas.microsoft.com/office/word/2010/wordml" wp14:textId="77777777">
       <w:pPr>
         <w:pStyle w:val="Normal"/>
         <w:rPr>
@@ -217,7 +217,7 @@
         <mc:AlternateContent>
           <mc:Choice Requires="wps">
             <w:drawing>
-              <wp:anchor distT="0" distB="14605" distL="0" distR="0" simplePos="0" relativeHeight="19" behindDoc="0" locked="0" layoutInCell="0" allowOverlap="1" wp14:anchorId="7F4EE135">
+              <wp:anchor xmlns:wp14="http://schemas.microsoft.com/office/word/2010/wordprocessingDrawing" distT="0" distB="14605" distL="0" distR="0" simplePos="0" relativeHeight="19" behindDoc="0" locked="0" layoutInCell="0" allowOverlap="1" wp14:anchorId="7F4EE135" wp14:editId="7777777">
                 <wp:simplePos x="0" y="0"/>
                 <wp:positionH relativeFrom="margin">
                   <wp:align>right</wp:align>
@@ -259,7 +259,7 @@
                       </wps:style>
                       <wps:txbx>
                         <w:txbxContent>
-                          <w:p>
+                          <w:p xmlns:wp14="http://schemas.microsoft.com/office/word/2010/wordml" wp14:textId="77777777">
                             <w:pPr>
                               <w:pStyle w:val="FrameContents"/>
                               <w:spacing w:before="120" w:after="160"/>
@@ -270,7 +270,7 @@
                               <w:t>Geschreven door (voor- en achternaam): Dylan Collet</w:t>
                             </w:r>
                           </w:p>
-                          <w:p>
+                          <w:p xmlns:wp14="http://schemas.microsoft.com/office/word/2010/wordml" wp14:textId="77777777">
                             <w:pPr>
                               <w:pStyle w:val="FrameContents"/>
                               <w:spacing w:before="120" w:after="160"/>
@@ -281,7 +281,7 @@
                               <w:t>Gecontroleerd door (voor- en achternaam): iedereen</w:t>
                             </w:r>
                           </w:p>
-                          <w:p>
+                          <w:p xmlns:wp14="http://schemas.microsoft.com/office/word/2010/wordml" wp14:textId="77777777">
                             <w:pPr>
                               <w:pStyle w:val="FrameContents"/>
                               <w:spacing w:before="120" w:after="160"/>
@@ -292,7 +292,7 @@
                               <w:t>Datum: 29/09/26</w:t>
                             </w:r>
                           </w:p>
-                          <w:p>
+                          <w:p xmlns:wp14="http://schemas.microsoft.com/office/word/2010/wordml" wp14:textId="77777777">
                             <w:pPr>
                               <w:pStyle w:val="FrameContents"/>
                               <w:spacing w:before="120" w:after="160"/>
@@ -318,13 +318,13 @@
             </w:drawing>
           </mc:Choice>
           <mc:Fallback>
-            <w:pict>
-              <v:rect id="shape_0" fillcolor="white" stroked="t" o:allowincell="f" style="position:absolute;margin-left:1.3pt;margin-top:22.2pt;width:452.2pt;height:94pt;mso-wrap-style:square;v-text-anchor:top;mso-position-horizontal:right;mso-position-horizontal-relative:margin" wp14:anchorId="7F4EE135">
-                <v:fill o:detectmouseclick="t" type="solid" color2="black"/>
-                <v:stroke color="black" weight="9360" joinstyle="miter" endcap="flat"/>
+            <w:pict w14:anchorId="2552F5EA">
+              <v:rect xmlns:wp14="http://schemas.microsoft.com/office/word/2010/wordprocessingDrawing" id="shape_0" style="position:absolute;margin-left:1.3pt;margin-top:22.2pt;width:452.2pt;height:94pt;mso-wrap-style:square;v-text-anchor:top;mso-position-horizontal:right;mso-position-horizontal-relative:margin" o:allowincell="f" fillcolor="white" stroked="t" wp14:anchorId="7F4EE135">
+                <v:fill type="solid" color2="black" o:detectmouseclick="t"/>
+                <v:stroke weight="9360" color="black" joinstyle="miter" endcap="flat"/>
                 <v:textbox>
                   <w:txbxContent>
-                    <w:p>
+                    <w:p xmlns:wp14="http://schemas.microsoft.com/office/word/2010/wordml" wp14:textId="77777777">
                       <w:pPr>
                         <w:pStyle w:val="FrameContents"/>
                         <w:spacing w:before="120" w:after="160"/>
@@ -335,7 +335,7 @@
                         <w:t>Geschreven door (voor- en achternaam): Dylan Collet</w:t>
                       </w:r>
                     </w:p>
-                    <w:p>
+                    <w:p xmlns:wp14="http://schemas.microsoft.com/office/word/2010/wordml" wp14:textId="77777777">
                       <w:pPr>
                         <w:pStyle w:val="FrameContents"/>
                         <w:spacing w:before="120" w:after="160"/>
@@ -346,7 +346,7 @@
                         <w:t>Gecontroleerd door (voor- en achternaam): iedereen</w:t>
                       </w:r>
                     </w:p>
-                    <w:p>
+                    <w:p xmlns:wp14="http://schemas.microsoft.com/office/word/2010/wordml" wp14:textId="77777777">
                       <w:pPr>
                         <w:pStyle w:val="FrameContents"/>
                         <w:spacing w:before="120" w:after="160"/>
@@ -357,7 +357,7 @@
                         <w:t>Datum: 29/09/26</w:t>
                       </w:r>
                     </w:p>
-                    <w:p>
+                    <w:p xmlns:wp14="http://schemas.microsoft.com/office/word/2010/wordml" wp14:textId="77777777">
                       <w:pPr>
                         <w:pStyle w:val="FrameContents"/>
                         <w:spacing w:before="120" w:after="160"/>
@@ -377,7 +377,7 @@
         </mc:AlternateContent>
       </w:r>
     </w:p>
-    <w:p>
+    <w:p xmlns:wp14="http://schemas.microsoft.com/office/word/2010/wordml" wp14:textId="77777777">
       <w:pPr>
         <w:pStyle w:val="Normal"/>
         <w:rPr>
@@ -390,7 +390,7 @@
         </w:rPr>
       </w:r>
     </w:p>
-    <w:p>
+    <w:p xmlns:wp14="http://schemas.microsoft.com/office/word/2010/wordml" wp14:textId="77777777">
       <w:pPr>
         <w:pStyle w:val="Normal"/>
         <w:rPr>
@@ -403,7 +403,7 @@
         </w:rPr>
       </w:r>
     </w:p>
-    <w:p>
+    <w:p xmlns:wp14="http://schemas.microsoft.com/office/word/2010/wordml" wp14:textId="77777777">
       <w:pPr>
         <w:pStyle w:val="Normal"/>
         <w:rPr>
@@ -416,7 +416,7 @@
         </w:rPr>
       </w:r>
     </w:p>
-    <w:p>
+    <w:p xmlns:wp14="http://schemas.microsoft.com/office/word/2010/wordml" wp14:textId="77777777">
       <w:pPr>
         <w:pStyle w:val="Normal"/>
         <w:rPr/>
@@ -427,13 +427,14 @@
     </w:p>
     <w:sdt>
       <w:sdtPr>
+        <w:id w:val="345460797"/>
         <w:docPartObj>
           <w:docPartGallery w:val="Table of Contents"/>
           <w:docPartUnique w:val="true"/>
         </w:docPartObj>
       </w:sdtPr>
       <w:sdtContent>
-        <w:p>
+        <w:p xmlns:wp14="http://schemas.microsoft.com/office/word/2010/wordml" wp14:textId="77777777">
           <w:pPr>
             <w:pStyle w:val="TOCHeading"/>
             <w:spacing w:before="0" w:after="0"/>
@@ -447,12 +448,12 @@
             <w:t>Inhoud</w:t>
           </w:r>
         </w:p>
-        <w:p>
+        <w:p xmlns:wp14="http://schemas.microsoft.com/office/word/2010/wordml" wp14:textId="77777777">
           <w:pPr>
             <w:pStyle w:val="TOC1"/>
             <w:tabs>
               <w:tab w:val="clear" w:pos="708"/>
-              <w:tab w:val="right" w:pos="9062" w:leader="dot"/>
+              <w:tab w:val="right" w:leader="dot" w:pos="9062"/>
             </w:tabs>
             <w:rPr>
               <w:rFonts w:eastAsia="" w:eastAsiaTheme="minorEastAsia"/>
@@ -510,6 +511,12 @@
                 <w:vanish w:val="false"/>
               </w:rPr>
               <w:tab/>
+            </w:r>
+            <w:r>
+              <w:rPr>
+                <w:rStyle w:val="IndexLink"/>
+                <w:vanish w:val="false"/>
+              </w:rPr>
               <w:t>3</w:t>
             </w:r>
             <w:r>
@@ -520,12 +527,12 @@
             </w:r>
           </w:hyperlink>
         </w:p>
-        <w:p>
+        <w:p xmlns:wp14="http://schemas.microsoft.com/office/word/2010/wordml" wp14:textId="77777777">
           <w:pPr>
             <w:pStyle w:val="TOC1"/>
             <w:tabs>
               <w:tab w:val="clear" w:pos="708"/>
-              <w:tab w:val="right" w:pos="9062" w:leader="dot"/>
+              <w:tab w:val="right" w:leader="dot" w:pos="9062"/>
             </w:tabs>
             <w:rPr>
               <w:rFonts w:eastAsia="" w:eastAsiaTheme="minorEastAsia"/>
@@ -566,6 +573,12 @@
                 <w:vanish w:val="false"/>
               </w:rPr>
               <w:tab/>
+            </w:r>
+            <w:r>
+              <w:rPr>
+                <w:rStyle w:val="IndexLink"/>
+                <w:vanish w:val="false"/>
+              </w:rPr>
               <w:t>4</w:t>
             </w:r>
             <w:r>
@@ -576,12 +589,12 @@
             </w:r>
           </w:hyperlink>
         </w:p>
-        <w:p>
+        <w:p xmlns:wp14="http://schemas.microsoft.com/office/word/2010/wordml" wp14:textId="77777777">
           <w:pPr>
             <w:pStyle w:val="TOC1"/>
             <w:tabs>
               <w:tab w:val="clear" w:pos="708"/>
-              <w:tab w:val="right" w:pos="9062" w:leader="dot"/>
+              <w:tab w:val="right" w:leader="dot" w:pos="9062"/>
             </w:tabs>
             <w:rPr>
               <w:rFonts w:eastAsia="" w:eastAsiaTheme="minorEastAsia"/>
@@ -622,6 +635,12 @@
                 <w:vanish w:val="false"/>
               </w:rPr>
               <w:tab/>
+            </w:r>
+            <w:r>
+              <w:rPr>
+                <w:rStyle w:val="IndexLink"/>
+                <w:vanish w:val="false"/>
+              </w:rPr>
               <w:t>5</w:t>
             </w:r>
             <w:r>
@@ -632,12 +651,12 @@
             </w:r>
           </w:hyperlink>
         </w:p>
-        <w:p>
+        <w:p xmlns:wp14="http://schemas.microsoft.com/office/word/2010/wordml" wp14:textId="77777777">
           <w:pPr>
             <w:pStyle w:val="TOC1"/>
             <w:tabs>
               <w:tab w:val="clear" w:pos="708"/>
-              <w:tab w:val="right" w:pos="9062" w:leader="dot"/>
+              <w:tab w:val="right" w:leader="dot" w:pos="9062"/>
             </w:tabs>
             <w:rPr>
               <w:rFonts w:eastAsia="" w:eastAsiaTheme="minorEastAsia"/>
@@ -679,6 +698,12 @@
                 <w:vanish w:val="false"/>
               </w:rPr>
               <w:tab/>
+            </w:r>
+            <w:r>
+              <w:rPr>
+                <w:rStyle w:val="IndexLink"/>
+                <w:vanish w:val="false"/>
+              </w:rPr>
               <w:t>7</w:t>
             </w:r>
             <w:r>
@@ -689,12 +714,12 @@
             </w:r>
           </w:hyperlink>
         </w:p>
-        <w:p>
+        <w:p xmlns:wp14="http://schemas.microsoft.com/office/word/2010/wordml" wp14:textId="77777777">
           <w:pPr>
             <w:pStyle w:val="TOC1"/>
             <w:tabs>
               <w:tab w:val="clear" w:pos="708"/>
-              <w:tab w:val="right" w:pos="9062" w:leader="dot"/>
+              <w:tab w:val="right" w:leader="dot" w:pos="9062"/>
             </w:tabs>
             <w:rPr>
               <w:rFonts w:eastAsia="" w:eastAsiaTheme="minorEastAsia"/>
@@ -735,6 +760,12 @@
                 <w:vanish w:val="false"/>
               </w:rPr>
               <w:tab/>
+            </w:r>
+            <w:r>
+              <w:rPr>
+                <w:rStyle w:val="IndexLink"/>
+                <w:vanish w:val="false"/>
+              </w:rPr>
               <w:t>8</w:t>
             </w:r>
             <w:r>
@@ -745,12 +776,12 @@
             </w:r>
           </w:hyperlink>
         </w:p>
-        <w:p>
+        <w:p xmlns:wp14="http://schemas.microsoft.com/office/word/2010/wordml" wp14:textId="77777777">
           <w:pPr>
             <w:pStyle w:val="TOC1"/>
             <w:tabs>
               <w:tab w:val="clear" w:pos="708"/>
-              <w:tab w:val="right" w:pos="9062" w:leader="dot"/>
+              <w:tab w:val="right" w:leader="dot" w:pos="9062"/>
             </w:tabs>
             <w:rPr>
               <w:rFonts w:eastAsia="" w:eastAsiaTheme="minorEastAsia"/>
@@ -791,6 +822,12 @@
                 <w:vanish w:val="false"/>
               </w:rPr>
               <w:tab/>
+            </w:r>
+            <w:r>
+              <w:rPr>
+                <w:rStyle w:val="IndexLink"/>
+                <w:vanish w:val="false"/>
+              </w:rPr>
               <w:t>9</w:t>
             </w:r>
             <w:r>
@@ -801,12 +838,12 @@
             </w:r>
           </w:hyperlink>
         </w:p>
-        <w:p>
+        <w:p xmlns:wp14="http://schemas.microsoft.com/office/word/2010/wordml" wp14:textId="77777777">
           <w:pPr>
             <w:pStyle w:val="TOC1"/>
             <w:tabs>
               <w:tab w:val="clear" w:pos="708"/>
-              <w:tab w:val="right" w:pos="9062" w:leader="dot"/>
+              <w:tab w:val="right" w:leader="dot" w:pos="9062"/>
             </w:tabs>
             <w:rPr>
               <w:rFonts w:eastAsia="" w:eastAsiaTheme="minorEastAsia"/>
@@ -847,6 +884,12 @@
                 <w:vanish w:val="false"/>
               </w:rPr>
               <w:tab/>
+            </w:r>
+            <w:r>
+              <w:rPr>
+                <w:rStyle w:val="IndexLink"/>
+                <w:vanish w:val="false"/>
+              </w:rPr>
               <w:t>10</w:t>
             </w:r>
             <w:r>
@@ -857,12 +900,12 @@
             </w:r>
           </w:hyperlink>
         </w:p>
-        <w:p>
+        <w:p xmlns:wp14="http://schemas.microsoft.com/office/word/2010/wordml" wp14:textId="77777777">
           <w:pPr>
             <w:pStyle w:val="TOC1"/>
             <w:tabs>
               <w:tab w:val="clear" w:pos="708"/>
-              <w:tab w:val="right" w:pos="9062" w:leader="dot"/>
+              <w:tab w:val="right" w:leader="dot" w:pos="9062"/>
             </w:tabs>
             <w:rPr>
               <w:rFonts w:eastAsia="" w:eastAsiaTheme="minorEastAsia"/>
@@ -903,6 +946,12 @@
                 <w:vanish w:val="false"/>
               </w:rPr>
               <w:tab/>
+            </w:r>
+            <w:r>
+              <w:rPr>
+                <w:rStyle w:val="IndexLink"/>
+                <w:vanish w:val="false"/>
+              </w:rPr>
               <w:t>11</w:t>
             </w:r>
             <w:r>
@@ -913,12 +962,12 @@
             </w:r>
           </w:hyperlink>
         </w:p>
-        <w:p>
+        <w:p xmlns:wp14="http://schemas.microsoft.com/office/word/2010/wordml" wp14:textId="77777777">
           <w:pPr>
             <w:pStyle w:val="TOC1"/>
             <w:tabs>
               <w:tab w:val="clear" w:pos="708"/>
-              <w:tab w:val="right" w:pos="9062" w:leader="dot"/>
+              <w:tab w:val="right" w:leader="dot" w:pos="9062"/>
             </w:tabs>
             <w:rPr>
               <w:rFonts w:eastAsia="" w:eastAsiaTheme="minorEastAsia"/>
@@ -959,6 +1008,12 @@
                 <w:vanish w:val="false"/>
               </w:rPr>
               <w:tab/>
+            </w:r>
+            <w:r>
+              <w:rPr>
+                <w:rStyle w:val="IndexLink"/>
+                <w:vanish w:val="false"/>
+              </w:rPr>
               <w:t>12</w:t>
             </w:r>
             <w:r>
@@ -969,12 +1024,12 @@
             </w:r>
           </w:hyperlink>
         </w:p>
-        <w:p>
+        <w:p xmlns:wp14="http://schemas.microsoft.com/office/word/2010/wordml" wp14:textId="77777777">
           <w:pPr>
             <w:pStyle w:val="TOC1"/>
             <w:tabs>
               <w:tab w:val="clear" w:pos="708"/>
-              <w:tab w:val="right" w:pos="9062" w:leader="dot"/>
+              <w:tab w:val="right" w:leader="dot" w:pos="9062"/>
             </w:tabs>
             <w:rPr>
               <w:rFonts w:eastAsia="" w:eastAsiaTheme="minorEastAsia"/>
@@ -1023,6 +1078,12 @@
                 <w:vanish w:val="false"/>
               </w:rPr>
               <w:tab/>
+            </w:r>
+            <w:r>
+              <w:rPr>
+                <w:rStyle w:val="IndexLink"/>
+                <w:vanish w:val="false"/>
+              </w:rPr>
               <w:t>13</w:t>
             </w:r>
             <w:r>
@@ -1033,12 +1094,12 @@
             </w:r>
           </w:hyperlink>
         </w:p>
-        <w:p>
+        <w:p xmlns:wp14="http://schemas.microsoft.com/office/word/2010/wordml" wp14:textId="77777777">
           <w:pPr>
             <w:pStyle w:val="TOC1"/>
             <w:tabs>
               <w:tab w:val="clear" w:pos="708"/>
-              <w:tab w:val="right" w:pos="9062" w:leader="dot"/>
+              <w:tab w:val="right" w:leader="dot" w:pos="9062"/>
             </w:tabs>
             <w:rPr>
               <w:rFonts w:eastAsia="" w:eastAsiaTheme="minorEastAsia"/>
@@ -1087,6 +1148,12 @@
                 <w:vanish w:val="false"/>
               </w:rPr>
               <w:tab/>
+            </w:r>
+            <w:r>
+              <w:rPr>
+                <w:rStyle w:val="IndexLink"/>
+                <w:vanish w:val="false"/>
+              </w:rPr>
               <w:t>14</w:t>
             </w:r>
             <w:r>
@@ -1097,12 +1164,12 @@
             </w:r>
           </w:hyperlink>
         </w:p>
-        <w:p>
+        <w:p xmlns:wp14="http://schemas.microsoft.com/office/word/2010/wordml" wp14:textId="77777777">
           <w:pPr>
             <w:pStyle w:val="TOC1"/>
             <w:tabs>
               <w:tab w:val="clear" w:pos="708"/>
-              <w:tab w:val="right" w:pos="9062" w:leader="dot"/>
+              <w:tab w:val="right" w:leader="dot" w:pos="9062"/>
             </w:tabs>
             <w:rPr>
               <w:rFonts w:eastAsia="" w:eastAsiaTheme="minorEastAsia"/>
@@ -1143,6 +1210,12 @@
                 <w:vanish w:val="false"/>
               </w:rPr>
               <w:tab/>
+            </w:r>
+            <w:r>
+              <w:rPr>
+                <w:rStyle w:val="IndexLink"/>
+                <w:vanish w:val="false"/>
+              </w:rPr>
               <w:t>15</w:t>
             </w:r>
             <w:r>
@@ -1153,12 +1226,12 @@
             </w:r>
           </w:hyperlink>
         </w:p>
-        <w:p>
+        <w:p xmlns:wp14="http://schemas.microsoft.com/office/word/2010/wordml" wp14:textId="77777777">
           <w:pPr>
             <w:pStyle w:val="TOC1"/>
             <w:tabs>
               <w:tab w:val="clear" w:pos="708"/>
-              <w:tab w:val="right" w:pos="9062" w:leader="dot"/>
+              <w:tab w:val="right" w:leader="dot" w:pos="9062"/>
             </w:tabs>
             <w:rPr>
               <w:rFonts w:eastAsia="" w:eastAsiaTheme="minorEastAsia"/>
@@ -1199,6 +1272,12 @@
                 <w:vanish w:val="false"/>
               </w:rPr>
               <w:tab/>
+            </w:r>
+            <w:r>
+              <w:rPr>
+                <w:rStyle w:val="IndexLink"/>
+                <w:vanish w:val="false"/>
+              </w:rPr>
               <w:t>16</w:t>
             </w:r>
             <w:r>
@@ -1209,7 +1288,7 @@
             </w:r>
           </w:hyperlink>
         </w:p>
-        <w:p>
+        <w:p xmlns:wp14="http://schemas.microsoft.com/office/word/2010/wordml" wp14:textId="77777777">
           <w:pPr>
             <w:pStyle w:val="Normal"/>
             <w:rPr/>
@@ -1224,29 +1303,29 @@
         </w:p>
       </w:sdtContent>
     </w:sdt>
-    <w:p>
-      <w:pPr>
-        <w:pStyle w:val="Normal"/>
-        <w:rPr/>
-      </w:pPr>
-      <w:r>
-        <w:rPr/>
-      </w:r>
-    </w:p>
-    <w:p>
-      <w:pPr>
-        <w:pStyle w:val="Normal"/>
-        <w:rPr>
-          <w:rFonts w:ascii="Calibri Light" w:hAnsi="Calibri Light" w:eastAsia="" w:cs="" w:asciiTheme="majorHAnsi" w:cstheme="majorBidi" w:eastAsiaTheme="majorEastAsia" w:hAnsiTheme="majorHAnsi"/>
-          <w:color w:themeColor="accent1" w:themeShade="bf" w:val="2F5496"/>
+    <w:p xmlns:wp14="http://schemas.microsoft.com/office/word/2010/wordml" wp14:textId="77777777">
+      <w:pPr>
+        <w:pStyle w:val="Normal"/>
+        <w:rPr/>
+      </w:pPr>
+      <w:r>
+        <w:rPr/>
+      </w:r>
+    </w:p>
+    <w:p xmlns:wp14="http://schemas.microsoft.com/office/word/2010/wordml" wp14:textId="77777777">
+      <w:pPr>
+        <w:pStyle w:val="Normal"/>
+        <w:rPr>
+          <w:rFonts w:ascii="Calibri Light" w:hAnsi="Calibri Light" w:eastAsia="" w:cs="" w:asciiTheme="majorHAnsi" w:hAnsiTheme="majorHAnsi" w:eastAsiaTheme="majorEastAsia" w:cstheme="majorBidi"/>
+          <w:color w:val="2F5496" w:themeColor="accent1" w:themeShade="bf"/>
           <w:sz w:val="32"/>
           <w:szCs w:val="32"/>
         </w:rPr>
       </w:pPr>
       <w:r>
         <w:rPr>
-          <w:rFonts w:eastAsia="" w:cs="" w:cstheme="majorBidi" w:eastAsiaTheme="majorEastAsia" w:ascii="Calibri Light" w:hAnsi="Calibri Light"/>
-          <w:color w:themeColor="accent1" w:themeShade="bf" w:val="2F5496"/>
+          <w:rFonts w:ascii="Calibri Light" w:hAnsi="Calibri Light" w:eastAsia="" w:cs="" w:eastAsiaTheme="majorEastAsia" w:cstheme="majorBidi"/>
+          <w:color w:val="2F5496" w:themeColor="accent1" w:themeShade="bf"/>
           <w:sz w:val="32"/>
           <w:szCs w:val="32"/>
         </w:rPr>
@@ -1255,51 +1334,138 @@
         <w:br w:type="page"/>
       </w:r>
     </w:p>
-    <w:p>
+    <w:p xmlns:wp14="http://schemas.microsoft.com/office/word/2010/wordml" wp14:textId="77777777">
       <w:pPr>
         <w:pStyle w:val="Heading1"/>
         <w:spacing w:before="0" w:after="0"/>
         <w:rPr/>
       </w:pPr>
-      <w:bookmarkStart w:id="0" w:name="_Toc183096218"/>
+      <w:bookmarkStart w:name="_Toc183096218" w:id="0"/>
       <w:r>
         <w:rPr/>
         <w:t>Inleiding</w:t>
       </w:r>
       <w:bookmarkEnd w:id="0"/>
     </w:p>
+    <w:p xmlns:wp14="http://schemas.microsoft.com/office/word/2010/wordml" wp14:textId="77777777">
+      <w:pPr>
+        <w:pStyle w:val="Normal"/>
+      </w:pPr>
+      <w:r>
+        <w:rPr>
+          <w:i w:val="1"/>
+          <w:iCs w:val="1"/>
+        </w:rPr>
+        <w:t>Dit Game Design Document beschrijft het proof of concept voor een first-person physics-puzzelspel, geïnspireerd door onder andere Half-Life 2, Garry's Mod en Portal. De kern van het concept is een speciale tool waarmee de speler objecten kan oppakken, verplaatsen, draaien en wegschieten om puzzels op te lossen. Het spel speelt zich af in een verlaten, industriële onderzoeksfaciliteit en richt zich op natuurkundige principes zoals zwaartekracht, massa, momentum en botsingen. De primaire doelgroep bestaat uit spelers vanaf ongeveer 12 jaar die houden van first-person games, puzzels en experimenteren met physics.</w:t>
+      </w:r>
+      <w:r>
+        <w:br w:type="page"/>
+      </w:r>
+    </w:p>
     <w:p>
       <w:pPr>
-        <w:pStyle w:val="Normal"/>
-        <w:rPr>
-          <w:i/>
-          <w:iCs/>
-        </w:rPr>
-      </w:pPr>
-      <w:r>
-        <w:rPr>
-          <w:i/>
-          <w:iCs/>
-        </w:rPr>
-        <w:t>Dit Game Design Document beschrijft het proof of concept voor een first-person physics-puzzelspel, geïnspireerd door onder andere Half-Life 2, Garry's Mod en Portal. De kern van het concept is een speciale tool waarmee de speler objecten kan oppakken, verplaatsen, draaien en wegschieten om puzzels op te lossen. Het spel speelt zich af in een verlaten, industriële onderzoeksfaciliteit en richt zich op natuurkundige principes zoals zwaartekracht, massa, momentum en botsingen. De primaire doelgroep bestaat uit spelers vanaf ongeveer 12 jaar die houden van first-person games, puzzels en experimenteren met physics.</w:t>
-      </w:r>
+        <w:pStyle w:val="Heading1"/>
+      </w:pPr>
+      <w:r>
+        <w:rPr/>
+        <w:t>Trello</w:t>
+      </w:r>
+    </w:p>
+    <w:p>
+      <w:pPr>
+        <w:pStyle w:val="Normal"/>
+        <w:widowControl w:val="1"/>
+        <w:bidi w:val="0"/>
+      </w:pPr>
+      <w:r>
+        <w:rPr/>
+        <w:t xml:space="preserve">Link: </w:t>
+      </w:r>
+      <w:hyperlink r:id="R9401cb74bcf44a05">
+        <w:r>
+          <w:rPr>
+            <w:rStyle w:val="Hyperlink"/>
+          </w:rPr>
+          <w:t>https://trello.com/invite/b/6abb85e32d2998fee74c1767/ATTIfd26c6b491843e8218f5d244a2e59a7892C52136/physics</w:t>
+        </w:r>
+      </w:hyperlink>
+    </w:p>
+    <w:p>
+      <w:pPr>
+        <w:pStyle w:val="Normal"/>
+      </w:pPr>
+      <w:r>
+        <w:drawing>
+          <wp:inline wp14:editId="3BC0C9E7" wp14:anchorId="105CAC66">
+            <wp:extent cx="5762625" cy="2762250"/>
+            <wp:effectExtent l="0" t="0" r="0" b="0"/>
+            <wp:docPr id="390679171" name="drawing"/>
+            <wp:cNvGraphicFramePr>
+              <a:graphicFrameLocks noChangeAspect="1"/>
+            </wp:cNvGraphicFramePr>
+            <a:graphic>
+              <a:graphicData xmlns:a="http://schemas.openxmlformats.org/drawingml/2006/main" uri="http://schemas.openxmlformats.org/drawingml/2006/picture">
+                <pic:pic xmlns:pic="http://schemas.openxmlformats.org/drawingml/2006/picture">
+                  <pic:nvPicPr>
+                    <pic:cNvPr id="2107886415" name="Picture 2107886415"/>
+                    <pic:cNvPicPr/>
+                  </pic:nvPicPr>
+                  <pic:blipFill>
+                    <a:blip xmlns:r="http://schemas.openxmlformats.org/officeDocument/2006/relationships" r:embed="rId1534463433">
+                      <a:extLst>
+                        <a:ext uri="{28A0092B-C50C-407E-A947-70E740481C1C}">
+                          <a14:useLocalDpi xmlns:a14="http://schemas.microsoft.com/office/drawing/2010/main"/>
+                        </a:ext>
+                      </a:extLst>
+                    </a:blip>
+                    <a:stretch>
+                      <a:fillRect/>
+                    </a:stretch>
+                  </pic:blipFill>
+                  <pic:spPr>
+                    <a:xfrm>
+                      <a:off x="0" y="0"/>
+                      <a:ext cx="5762625" cy="2762250"/>
+                    </a:xfrm>
+                    <a:prstGeom prst="rect">
+                      <a:avLst/>
+                    </a:prstGeom>
+                  </pic:spPr>
+                </pic:pic>
+              </a:graphicData>
+            </a:graphic>
+          </wp:inline>
+        </w:drawing>
+      </w:r>
+    </w:p>
+    <w:p>
       <w:r>
         <w:br w:type="page"/>
       </w:r>
     </w:p>
     <w:p>
       <w:pPr>
+        <w:pStyle w:val="Normal"/>
+      </w:pPr>
+    </w:p>
+    <w:p>
+      <w:pPr>
+        <w:pStyle w:val="Normal"/>
+      </w:pPr>
+    </w:p>
+    <w:p xmlns:wp14="http://schemas.microsoft.com/office/word/2010/wordml" wp14:textId="77777777">
+      <w:pPr>
         <w:pStyle w:val="Heading1"/>
         <w:rPr/>
       </w:pPr>
-      <w:bookmarkStart w:id="1" w:name="_Toc183096219"/>
+      <w:bookmarkStart w:name="_Toc183096219" w:id="1"/>
       <w:r>
         <w:rPr/>
         <w:t>Overzicht</w:t>
       </w:r>
       <w:bookmarkEnd w:id="1"/>
     </w:p>
-    <w:p>
+    <w:p xmlns:wp14="http://schemas.microsoft.com/office/word/2010/wordml" wp14:textId="77777777">
       <w:pPr>
         <w:pStyle w:val="Normal"/>
         <w:rPr>
@@ -1327,24 +1493,24 @@
           <w:bottom w:w="0" w:type="dxa"/>
           <w:end w:w="108" w:type="dxa"/>
         </w:tblCellMar>
-        <w:tblLook w:val="04a0" w:firstRow="1" w:noVBand="1" w:lastRow="0" w:firstColumn="1" w:lastColumn="0" w:noHBand="0"/>
+        <w:tblLook w:val="04a0" w:firstRow="1" w:lastRow="0" w:firstColumn="1" w:lastColumn="0" w:noHBand="0" w:noVBand="1"/>
       </w:tblPr>
       <w:tblGrid>
         <w:gridCol w:w="2972"/>
         <w:gridCol w:w="6090"/>
       </w:tblGrid>
-      <w:tr>
+      <w:tr xmlns:wp14="http://schemas.microsoft.com/office/word/2010/wordml" wp14:textId="77777777">
         <w:trPr/>
         <w:tc>
           <w:tcPr>
             <w:tcW w:w="2972" w:type="dxa"/>
             <w:tcBorders/>
           </w:tcPr>
-          <w:p>
+          <w:p wp14:textId="77777777">
             <w:pPr>
               <w:pStyle w:val="Normal"/>
               <w:widowControl/>
-              <w:spacing w:lineRule="auto" w:line="240" w:before="0" w:after="0"/>
+              <w:spacing w:before="0" w:after="0" w:line="240" w:lineRule="auto"/>
               <w:jc w:val="start"/>
               <w:rPr>
                 <w:b/>
@@ -1364,11 +1530,11 @@
               <w:t>Titel/ Werktitel van het spel:</w:t>
             </w:r>
           </w:p>
-          <w:p>
+          <w:p wp14:textId="77777777">
             <w:pPr>
               <w:pStyle w:val="Normal"/>
               <w:widowControl/>
-              <w:spacing w:lineRule="auto" w:line="240" w:before="0" w:after="0"/>
+              <w:spacing w:before="0" w:after="0" w:line="240" w:lineRule="auto"/>
               <w:jc w:val="start"/>
               <w:rPr>
                 <w:b/>
@@ -1393,11 +1559,11 @@
             <w:tcW w:w="6090" w:type="dxa"/>
             <w:tcBorders/>
           </w:tcPr>
-          <w:p>
+          <w:p wp14:textId="77777777">
             <w:pPr>
               <w:pStyle w:val="Normal"/>
               <w:widowControl/>
-              <w:spacing w:lineRule="auto" w:line="240" w:before="0" w:after="0"/>
+              <w:spacing w:before="0" w:after="0" w:line="240" w:lineRule="auto"/>
               <w:jc w:val="start"/>
               <w:rPr>
                 <w:rFonts w:ascii="Calibri" w:hAnsi="Calibri" w:eastAsia="Calibri" w:cs=""/>
@@ -1420,18 +1586,18 @@
           </w:p>
         </w:tc>
       </w:tr>
-      <w:tr>
+      <w:tr xmlns:wp14="http://schemas.microsoft.com/office/word/2010/wordml" wp14:textId="77777777">
         <w:trPr/>
         <w:tc>
           <w:tcPr>
             <w:tcW w:w="2972" w:type="dxa"/>
             <w:tcBorders/>
           </w:tcPr>
-          <w:p>
+          <w:p wp14:textId="77777777">
             <w:pPr>
               <w:pStyle w:val="Normal"/>
               <w:widowControl/>
-              <w:spacing w:lineRule="auto" w:line="240" w:before="0" w:after="0"/>
+              <w:spacing w:before="0" w:after="0" w:line="240" w:lineRule="auto"/>
               <w:jc w:val="start"/>
               <w:rPr>
                 <w:b/>
@@ -1451,11 +1617,11 @@
               <w:t>Genre:</w:t>
             </w:r>
           </w:p>
-          <w:p>
+          <w:p wp14:textId="77777777">
             <w:pPr>
               <w:pStyle w:val="Normal"/>
               <w:widowControl/>
-              <w:spacing w:lineRule="auto" w:line="240" w:before="0" w:after="0"/>
+              <w:spacing w:before="0" w:after="0" w:line="240" w:lineRule="auto"/>
               <w:jc w:val="start"/>
               <w:rPr>
                 <w:b/>
@@ -1480,11 +1646,11 @@
             <w:tcW w:w="6090" w:type="dxa"/>
             <w:tcBorders/>
           </w:tcPr>
-          <w:p>
+          <w:p wp14:textId="77777777">
             <w:pPr>
               <w:pStyle w:val="Normal"/>
               <w:widowControl/>
-              <w:spacing w:lineRule="auto" w:line="240" w:before="0" w:after="0"/>
+              <w:spacing w:before="0" w:after="0" w:line="240" w:lineRule="auto"/>
               <w:jc w:val="start"/>
               <w:rPr>
                 <w:rFonts w:ascii="Calibri" w:hAnsi="Calibri" w:eastAsia="Calibri" w:cs=""/>
@@ -1507,18 +1673,18 @@
           </w:p>
         </w:tc>
       </w:tr>
-      <w:tr>
+      <w:tr xmlns:wp14="http://schemas.microsoft.com/office/word/2010/wordml" wp14:textId="77777777">
         <w:trPr/>
         <w:tc>
           <w:tcPr>
             <w:tcW w:w="2972" w:type="dxa"/>
             <w:tcBorders/>
           </w:tcPr>
-          <w:p>
+          <w:p wp14:textId="77777777">
             <w:pPr>
               <w:pStyle w:val="Normal"/>
               <w:widowControl/>
-              <w:spacing w:lineRule="auto" w:line="240" w:before="0" w:after="0"/>
+              <w:spacing w:before="0" w:after="0" w:line="240" w:lineRule="auto"/>
               <w:jc w:val="start"/>
               <w:rPr>
                 <w:b/>
@@ -1538,11 +1704,11 @@
               <w:t>Thema:</w:t>
             </w:r>
           </w:p>
-          <w:p>
+          <w:p wp14:textId="77777777">
             <w:pPr>
               <w:pStyle w:val="Normal"/>
               <w:widowControl/>
-              <w:spacing w:lineRule="auto" w:line="240" w:before="0" w:after="0"/>
+              <w:spacing w:before="0" w:after="0" w:line="240" w:lineRule="auto"/>
               <w:jc w:val="start"/>
               <w:rPr>
                 <w:b/>
@@ -1567,11 +1733,11 @@
             <w:tcW w:w="6090" w:type="dxa"/>
             <w:tcBorders/>
           </w:tcPr>
-          <w:p>
+          <w:p wp14:textId="77777777">
             <w:pPr>
               <w:pStyle w:val="Normal"/>
               <w:widowControl/>
-              <w:spacing w:lineRule="auto" w:line="240" w:before="0" w:after="0"/>
+              <w:spacing w:before="0" w:after="0" w:line="240" w:lineRule="auto"/>
               <w:jc w:val="start"/>
               <w:rPr>
                 <w:rFonts w:ascii="Calibri" w:hAnsi="Calibri" w:eastAsia="Calibri" w:cs=""/>
@@ -1594,18 +1760,18 @@
           </w:p>
         </w:tc>
       </w:tr>
-      <w:tr>
+      <w:tr xmlns:wp14="http://schemas.microsoft.com/office/word/2010/wordml" wp14:textId="77777777">
         <w:trPr/>
         <w:tc>
           <w:tcPr>
             <w:tcW w:w="2972" w:type="dxa"/>
             <w:tcBorders/>
           </w:tcPr>
-          <w:p>
+          <w:p wp14:textId="77777777">
             <w:pPr>
               <w:pStyle w:val="Normal"/>
               <w:widowControl/>
-              <w:spacing w:lineRule="auto" w:line="240" w:before="0" w:after="0"/>
+              <w:spacing w:before="0" w:after="0" w:line="240" w:lineRule="auto"/>
               <w:jc w:val="start"/>
               <w:rPr>
                 <w:b/>
@@ -1625,11 +1791,11 @@
               <w:t>Perspectief/View:</w:t>
             </w:r>
           </w:p>
-          <w:p>
+          <w:p wp14:textId="77777777">
             <w:pPr>
               <w:pStyle w:val="Normal"/>
               <w:widowControl/>
-              <w:spacing w:lineRule="auto" w:line="240" w:before="0" w:after="0"/>
+              <w:spacing w:before="0" w:after="0" w:line="240" w:lineRule="auto"/>
               <w:jc w:val="start"/>
               <w:rPr>
                 <w:b/>
@@ -1654,11 +1820,11 @@
             <w:tcW w:w="6090" w:type="dxa"/>
             <w:tcBorders/>
           </w:tcPr>
-          <w:p>
+          <w:p wp14:textId="77777777">
             <w:pPr>
               <w:pStyle w:val="Normal"/>
               <w:widowControl/>
-              <w:spacing w:lineRule="auto" w:line="240" w:before="0" w:after="0"/>
+              <w:spacing w:before="0" w:after="0" w:line="240" w:lineRule="auto"/>
               <w:jc w:val="start"/>
               <w:rPr>
                 <w:rFonts w:ascii="Calibri" w:hAnsi="Calibri" w:eastAsia="Calibri" w:cs=""/>
@@ -1681,18 +1847,18 @@
           </w:p>
         </w:tc>
       </w:tr>
-      <w:tr>
+      <w:tr xmlns:wp14="http://schemas.microsoft.com/office/word/2010/wordml" wp14:textId="77777777">
         <w:trPr/>
         <w:tc>
           <w:tcPr>
             <w:tcW w:w="2972" w:type="dxa"/>
             <w:tcBorders/>
           </w:tcPr>
-          <w:p>
+          <w:p wp14:textId="77777777">
             <w:pPr>
               <w:pStyle w:val="Normal"/>
               <w:widowControl/>
-              <w:spacing w:lineRule="auto" w:line="240" w:before="0" w:after="0"/>
+              <w:spacing w:before="0" w:after="0" w:line="240" w:lineRule="auto"/>
               <w:jc w:val="start"/>
               <w:rPr>
                 <w:b/>
@@ -1712,11 +1878,11 @@
               <w:t>Doel van het spel:</w:t>
             </w:r>
           </w:p>
-          <w:p>
+          <w:p wp14:textId="77777777">
             <w:pPr>
               <w:pStyle w:val="Normal"/>
               <w:widowControl/>
-              <w:spacing w:lineRule="auto" w:line="240" w:before="0" w:after="0"/>
+              <w:spacing w:before="0" w:after="0" w:line="240" w:lineRule="auto"/>
               <w:jc w:val="start"/>
               <w:rPr>
                 <w:b/>
@@ -1741,11 +1907,11 @@
             <w:tcW w:w="6090" w:type="dxa"/>
             <w:tcBorders/>
           </w:tcPr>
-          <w:p>
+          <w:p wp14:textId="77777777">
             <w:pPr>
               <w:pStyle w:val="Normal"/>
               <w:widowControl/>
-              <w:spacing w:lineRule="auto" w:line="240" w:before="0" w:after="0"/>
+              <w:spacing w:before="0" w:after="0" w:line="240" w:lineRule="auto"/>
               <w:jc w:val="start"/>
               <w:rPr>
                 <w:rFonts w:ascii="Calibri" w:hAnsi="Calibri" w:eastAsia="Calibri" w:cs=""/>
@@ -1768,18 +1934,18 @@
           </w:p>
         </w:tc>
       </w:tr>
-      <w:tr>
+      <w:tr xmlns:wp14="http://schemas.microsoft.com/office/word/2010/wordml" wp14:textId="77777777">
         <w:trPr/>
         <w:tc>
           <w:tcPr>
             <w:tcW w:w="2972" w:type="dxa"/>
             <w:tcBorders/>
           </w:tcPr>
-          <w:p>
+          <w:p wp14:textId="77777777">
             <w:pPr>
               <w:pStyle w:val="Normal"/>
               <w:widowControl/>
-              <w:spacing w:lineRule="auto" w:line="240" w:before="0" w:after="0"/>
+              <w:spacing w:before="0" w:after="0" w:line="240" w:lineRule="auto"/>
               <w:jc w:val="start"/>
               <w:rPr>
                 <w:b/>
@@ -1800,11 +1966,11 @@
               <w:t>Art Stijl:</w:t>
             </w:r>
           </w:p>
-          <w:p>
+          <w:p wp14:textId="77777777">
             <w:pPr>
               <w:pStyle w:val="Normal"/>
               <w:widowControl/>
-              <w:spacing w:lineRule="auto" w:line="240" w:before="0" w:after="0"/>
+              <w:spacing w:before="0" w:after="0" w:line="240" w:lineRule="auto"/>
               <w:jc w:val="start"/>
               <w:rPr>
                 <w:b/>
@@ -1829,11 +1995,11 @@
             <w:tcW w:w="6090" w:type="dxa"/>
             <w:tcBorders/>
           </w:tcPr>
-          <w:p>
+          <w:p wp14:textId="77777777">
             <w:pPr>
               <w:pStyle w:val="Normal"/>
               <w:widowControl/>
-              <w:spacing w:lineRule="auto" w:line="240" w:before="0" w:after="0"/>
+              <w:spacing w:before="0" w:after="0" w:line="240" w:lineRule="auto"/>
               <w:jc w:val="start"/>
               <w:rPr>
                 <w:rFonts w:ascii="Calibri" w:hAnsi="Calibri" w:eastAsia="Calibri" w:cs=""/>
@@ -1856,7 +2022,7 @@
           </w:p>
         </w:tc>
       </w:tr>
-      <w:tr>
+      <w:tr xmlns:wp14="http://schemas.microsoft.com/office/word/2010/wordml" wp14:textId="77777777">
         <w:trPr>
           <w:trHeight w:val="1798" w:hRule="atLeast"/>
         </w:trPr>
@@ -1865,11 +2031,11 @@
             <w:tcW w:w="2972" w:type="dxa"/>
             <w:tcBorders/>
           </w:tcPr>
-          <w:p>
+          <w:p wp14:textId="77777777">
             <w:pPr>
               <w:pStyle w:val="Normal"/>
               <w:widowControl/>
-              <w:spacing w:lineRule="auto" w:line="240" w:before="0" w:after="0"/>
+              <w:spacing w:before="0" w:after="0" w:line="240" w:lineRule="auto"/>
               <w:jc w:val="start"/>
               <w:rPr>
                 <w:b/>
@@ -1890,11 +2056,11 @@
               <w:t>Originaliteit/USP (Unique Selling Point):</w:t>
             </w:r>
           </w:p>
-          <w:p>
+          <w:p wp14:textId="77777777">
             <w:pPr>
               <w:pStyle w:val="Normal"/>
               <w:widowControl/>
-              <w:spacing w:lineRule="auto" w:line="240" w:before="0" w:after="0"/>
+              <w:spacing w:before="0" w:after="0" w:line="240" w:lineRule="auto"/>
               <w:jc w:val="start"/>
               <w:rPr>
                 <w:b/>
@@ -1920,11 +2086,11 @@
             <w:tcW w:w="6090" w:type="dxa"/>
             <w:tcBorders/>
           </w:tcPr>
-          <w:p>
+          <w:p wp14:textId="77777777">
             <w:pPr>
               <w:pStyle w:val="Normal"/>
               <w:widowControl/>
-              <w:spacing w:lineRule="auto" w:line="240" w:before="0" w:after="0"/>
+              <w:spacing w:before="0" w:after="0" w:line="240" w:lineRule="auto"/>
               <w:jc w:val="start"/>
               <w:rPr>
                 <w:rFonts w:ascii="Calibri" w:hAnsi="Calibri" w:eastAsia="Calibri" w:cs=""/>
@@ -1947,7 +2113,7 @@
           </w:p>
         </w:tc>
       </w:tr>
-      <w:tr>
+      <w:tr xmlns:wp14="http://schemas.microsoft.com/office/word/2010/wordml" wp14:textId="77777777">
         <w:trPr>
           <w:trHeight w:val="2390" w:hRule="atLeast"/>
         </w:trPr>
@@ -1956,11 +2122,11 @@
             <w:tcW w:w="2972" w:type="dxa"/>
             <w:tcBorders/>
           </w:tcPr>
-          <w:p>
+          <w:p wp14:textId="77777777">
             <w:pPr>
               <w:pStyle w:val="Normal"/>
               <w:widowControl/>
-              <w:spacing w:lineRule="auto" w:line="240" w:before="0" w:after="0"/>
+              <w:spacing w:before="0" w:after="0" w:line="240" w:lineRule="auto"/>
               <w:jc w:val="start"/>
               <w:rPr>
                 <w:b/>
@@ -1980,11 +2146,11 @@
               <w:t xml:space="preserve">Korte Samenvatting (maximaal 2 zinnen): </w:t>
             </w:r>
           </w:p>
-          <w:p>
+          <w:p wp14:textId="77777777">
             <w:pPr>
               <w:pStyle w:val="Normal"/>
               <w:widowControl/>
-              <w:spacing w:lineRule="auto" w:line="240" w:before="0" w:after="0"/>
+              <w:spacing w:before="0" w:after="0" w:line="240" w:lineRule="auto"/>
               <w:jc w:val="start"/>
               <w:rPr>
                 <w:b/>
@@ -2010,11 +2176,11 @@
             <w:tcW w:w="6090" w:type="dxa"/>
             <w:tcBorders/>
           </w:tcPr>
-          <w:p>
+          <w:p wp14:textId="77777777">
             <w:pPr>
               <w:pStyle w:val="Normal"/>
               <w:widowControl/>
-              <w:spacing w:lineRule="auto" w:line="240" w:before="0" w:after="0"/>
+              <w:spacing w:before="0" w:after="0" w:line="240" w:lineRule="auto"/>
               <w:jc w:val="start"/>
               <w:rPr>
                 <w:rFonts w:ascii="Calibri" w:hAnsi="Calibri" w:eastAsia="Calibri" w:cs=""/>
@@ -2038,20 +2204,20 @@
         </w:tc>
       </w:tr>
     </w:tbl>
-    <w:p>
-      <w:pPr>
-        <w:pStyle w:val="Normal"/>
-        <w:rPr>
-          <w:rFonts w:ascii="Calibri Light" w:hAnsi="Calibri Light" w:eastAsia="" w:cs="" w:asciiTheme="majorHAnsi" w:cstheme="majorBidi" w:eastAsiaTheme="majorEastAsia" w:hAnsiTheme="majorHAnsi"/>
-          <w:color w:themeColor="accent1" w:themeShade="bf" w:val="2F5496"/>
+    <w:p xmlns:wp14="http://schemas.microsoft.com/office/word/2010/wordml" wp14:textId="77777777">
+      <w:pPr>
+        <w:pStyle w:val="Normal"/>
+        <w:rPr>
+          <w:rFonts w:ascii="Calibri Light" w:hAnsi="Calibri Light" w:eastAsia="" w:cs="" w:asciiTheme="majorHAnsi" w:hAnsiTheme="majorHAnsi" w:eastAsiaTheme="majorEastAsia" w:cstheme="majorBidi"/>
+          <w:color w:val="2F5496" w:themeColor="accent1" w:themeShade="bf"/>
           <w:sz w:val="32"/>
           <w:szCs w:val="32"/>
         </w:rPr>
       </w:pPr>
       <w:r>
         <w:rPr>
-          <w:rFonts w:eastAsia="" w:cs="" w:cstheme="majorBidi" w:eastAsiaTheme="majorEastAsia" w:ascii="Calibri Light" w:hAnsi="Calibri Light"/>
-          <w:color w:themeColor="accent1" w:themeShade="bf" w:val="2F5496"/>
+          <w:rFonts w:ascii="Calibri Light" w:hAnsi="Calibri Light" w:eastAsia="" w:cs="" w:eastAsiaTheme="majorEastAsia" w:cstheme="majorBidi"/>
+          <w:color w:val="2F5496" w:themeColor="accent1" w:themeShade="bf"/>
           <w:sz w:val="32"/>
           <w:szCs w:val="32"/>
         </w:rPr>
@@ -2060,26 +2226,26 @@
         <w:br w:type="page"/>
       </w:r>
     </w:p>
-    <w:p>
+    <w:p xmlns:wp14="http://schemas.microsoft.com/office/word/2010/wordml" wp14:textId="77777777">
       <w:pPr>
         <w:pStyle w:val="Heading1"/>
         <w:spacing w:before="0" w:after="0"/>
         <w:rPr/>
       </w:pPr>
-      <w:bookmarkStart w:id="2" w:name="_Toc183096220"/>
+      <w:bookmarkStart w:name="_Toc183096220" w:id="2"/>
       <w:r>
         <w:rPr/>
         <w:t>Configuration/ Technical Specs</w:t>
       </w:r>
       <w:bookmarkEnd w:id="2"/>
     </w:p>
-    <w:p>
+    <w:p xmlns:wp14="http://schemas.microsoft.com/office/word/2010/wordml" wp14:textId="77777777">
       <w:pPr>
         <w:pStyle w:val="Heading2"/>
         <w:rPr/>
       </w:pPr>
-      <w:bookmarkStart w:id="3" w:name="_Toc164756209"/>
-      <w:bookmarkStart w:id="4" w:name="_Toc158276165"/>
+      <w:bookmarkStart w:name="_Toc164756209" w:id="3"/>
+      <w:bookmarkStart w:name="_Toc158276165" w:id="4"/>
       <w:r>
         <w:rPr/>
         <w:t>Te Gebruiken Hardware</w:t>
@@ -2087,7 +2253,7 @@
       <w:bookmarkEnd w:id="3"/>
       <w:bookmarkEnd w:id="4"/>
     </w:p>
-    <w:p>
+    <w:p xmlns:wp14="http://schemas.microsoft.com/office/word/2010/wordml" wp14:textId="77777777">
       <w:pPr>
         <w:pStyle w:val="Normal"/>
         <w:rPr>
@@ -2115,26 +2281,26 @@
           <w:bottom w:w="0" w:type="dxa"/>
           <w:end w:w="108" w:type="dxa"/>
         </w:tblCellMar>
-        <w:tblLook w:val="04a0" w:firstRow="1" w:noVBand="1" w:lastRow="0" w:firstColumn="1" w:lastColumn="0" w:noHBand="0"/>
+        <w:tblLook w:val="04a0" w:firstRow="1" w:lastRow="0" w:firstColumn="1" w:lastColumn="0" w:noHBand="0" w:noVBand="1"/>
       </w:tblPr>
       <w:tblGrid>
         <w:gridCol w:w="4530"/>
         <w:gridCol w:w="4532"/>
       </w:tblGrid>
-      <w:tr>
+      <w:tr xmlns:wp14="http://schemas.microsoft.com/office/word/2010/wordml" wp14:textId="77777777">
         <w:trPr/>
         <w:tc>
           <w:tcPr>
             <w:tcW w:w="4530" w:type="dxa"/>
             <w:tcBorders/>
-            <w:shd w:color="auto" w:fill="BFBFBF" w:themeFill="background1" w:themeFillShade="bf" w:val="clear"/>
+            <w:shd w:val="clear" w:color="auto" w:fill="BFBFBF" w:themeFill="background1" w:themeFillShade="bf"/>
             <w:vAlign w:val="bottom"/>
           </w:tcPr>
-          <w:p>
+          <w:p wp14:textId="77777777">
             <w:pPr>
               <w:pStyle w:val="Normal"/>
               <w:widowControl/>
-              <w:spacing w:lineRule="auto" w:line="240" w:before="0" w:after="200"/>
+              <w:spacing w:before="0" w:after="200" w:line="240" w:lineRule="auto"/>
               <w:jc w:val="center"/>
               <w:rPr>
                 <w:rFonts w:cs="Calibri" w:cstheme="minorHAnsi"/>
@@ -2156,14 +2322,14 @@
           <w:tcPr>
             <w:tcW w:w="4532" w:type="dxa"/>
             <w:tcBorders/>
-            <w:shd w:color="auto" w:fill="BFBFBF" w:themeFill="background1" w:themeFillShade="bf" w:val="clear"/>
+            <w:shd w:val="clear" w:color="auto" w:fill="BFBFBF" w:themeFill="background1" w:themeFillShade="bf"/>
             <w:vAlign w:val="bottom"/>
           </w:tcPr>
-          <w:p>
+          <w:p wp14:textId="77777777">
             <w:pPr>
               <w:pStyle w:val="Normal"/>
               <w:widowControl/>
-              <w:spacing w:lineRule="auto" w:line="240" w:before="0" w:after="200"/>
+              <w:spacing w:before="0" w:after="200" w:line="240" w:lineRule="auto"/>
               <w:jc w:val="center"/>
               <w:rPr>
                 <w:rFonts w:cs="Calibri" w:cstheme="minorHAnsi"/>
@@ -2182,18 +2348,18 @@
           </w:p>
         </w:tc>
       </w:tr>
-      <w:tr>
+      <w:tr xmlns:wp14="http://schemas.microsoft.com/office/word/2010/wordml" wp14:textId="77777777">
         <w:trPr/>
         <w:tc>
           <w:tcPr>
             <w:tcW w:w="4530" w:type="dxa"/>
             <w:tcBorders/>
           </w:tcPr>
-          <w:p>
+          <w:p wp14:textId="77777777">
             <w:pPr>
               <w:pStyle w:val="Normal"/>
               <w:widowControl/>
-              <w:spacing w:lineRule="auto" w:line="240" w:before="0" w:after="0"/>
+              <w:spacing w:before="0" w:after="0" w:line="240" w:lineRule="auto"/>
               <w:jc w:val="start"/>
               <w:rPr>
                 <w:rFonts w:ascii="Calibri" w:hAnsi="Calibri" w:eastAsia="Calibri" w:cs=""/>
@@ -2220,11 +2386,11 @@
             <w:tcW w:w="4532" w:type="dxa"/>
             <w:tcBorders/>
           </w:tcPr>
-          <w:p>
+          <w:p wp14:textId="77777777">
             <w:pPr>
               <w:pStyle w:val="Normal"/>
               <w:widowControl/>
-              <w:spacing w:lineRule="auto" w:line="240" w:before="0" w:after="0"/>
+              <w:spacing w:before="0" w:after="0" w:line="240" w:lineRule="auto"/>
               <w:jc w:val="start"/>
               <w:rPr>
                 <w:rFonts w:ascii="Calibri" w:hAnsi="Calibri" w:eastAsia="Calibri" w:cs=""/>
@@ -2247,18 +2413,18 @@
           </w:p>
         </w:tc>
       </w:tr>
-      <w:tr>
+      <w:tr xmlns:wp14="http://schemas.microsoft.com/office/word/2010/wordml" wp14:textId="77777777">
         <w:trPr/>
         <w:tc>
           <w:tcPr>
             <w:tcW w:w="4530" w:type="dxa"/>
             <w:tcBorders/>
           </w:tcPr>
-          <w:p>
+          <w:p wp14:textId="77777777">
             <w:pPr>
               <w:pStyle w:val="Normal"/>
               <w:widowControl/>
-              <w:spacing w:lineRule="auto" w:line="240" w:before="0" w:after="0"/>
+              <w:spacing w:before="0" w:after="0" w:line="240" w:lineRule="auto"/>
               <w:jc w:val="start"/>
               <w:rPr>
                 <w:rFonts w:ascii="Calibri" w:hAnsi="Calibri" w:eastAsia="Calibri" w:cs=""/>
@@ -2285,11 +2451,11 @@
             <w:tcW w:w="4532" w:type="dxa"/>
             <w:tcBorders/>
           </w:tcPr>
-          <w:p>
+          <w:p wp14:textId="77777777">
             <w:pPr>
               <w:pStyle w:val="Normal"/>
               <w:widowControl/>
-              <w:spacing w:lineRule="auto" w:line="240" w:before="0" w:after="0"/>
+              <w:spacing w:before="0" w:after="0" w:line="240" w:lineRule="auto"/>
               <w:jc w:val="start"/>
               <w:rPr>
                 <w:rFonts w:ascii="Calibri" w:hAnsi="Calibri" w:eastAsia="Calibri" w:cs=""/>
@@ -2313,25 +2479,25 @@
         </w:tc>
       </w:tr>
     </w:tbl>
-    <w:p>
-      <w:pPr>
-        <w:pStyle w:val="Normal"/>
-        <w:spacing w:lineRule="auto" w:line="276" w:before="0" w:after="200"/>
-        <w:rPr>
-          <w:rFonts w:eastAsia="" w:cs="Calibri" w:cstheme="minorHAnsi" w:eastAsiaTheme="majorEastAsia"/>
+    <w:p xmlns:wp14="http://schemas.microsoft.com/office/word/2010/wordml" wp14:textId="77777777">
+      <w:pPr>
+        <w:pStyle w:val="Normal"/>
+        <w:spacing w:before="0" w:after="200" w:line="276" w:lineRule="auto"/>
+        <w:rPr>
+          <w:rFonts w:eastAsia="" w:cs="Calibri" w:eastAsiaTheme="majorEastAsia" w:cstheme="minorHAnsi"/>
           <w:b/>
           <w:bCs/>
-          <w:color w:themeColor="accent1" w:themeShade="bf" w:val="2F5496"/>
+          <w:color w:val="2F5496" w:themeColor="accent1" w:themeShade="bf"/>
           <w:sz w:val="28"/>
           <w:szCs w:val="28"/>
         </w:rPr>
       </w:pPr>
       <w:r>
         <w:rPr>
-          <w:rFonts w:eastAsia="" w:cs="Calibri" w:cstheme="minorHAnsi" w:eastAsiaTheme="majorEastAsia"/>
+          <w:rFonts w:eastAsia="" w:cs="Calibri" w:eastAsiaTheme="majorEastAsia" w:cstheme="minorHAnsi"/>
           <w:b/>
           <w:bCs/>
-          <w:color w:themeColor="accent1" w:themeShade="bf" w:val="2F5496"/>
+          <w:color w:val="2F5496" w:themeColor="accent1" w:themeShade="bf"/>
           <w:sz w:val="28"/>
           <w:szCs w:val="28"/>
         </w:rPr>
@@ -2340,14 +2506,14 @@
         <w:br w:type="page"/>
       </w:r>
     </w:p>
-    <w:p>
+    <w:p xmlns:wp14="http://schemas.microsoft.com/office/word/2010/wordml" wp14:textId="77777777">
       <w:pPr>
         <w:pStyle w:val="Heading2"/>
         <w:spacing w:before="0" w:after="0"/>
         <w:rPr/>
       </w:pPr>
-      <w:bookmarkStart w:id="5" w:name="_Toc164756210"/>
-      <w:bookmarkStart w:id="6" w:name="_Toc158276166"/>
+      <w:bookmarkStart w:name="_Toc164756210" w:id="5"/>
+      <w:bookmarkStart w:name="_Toc158276166" w:id="6"/>
       <w:r>
         <w:rPr/>
         <w:t>Te Gebruiken Software</w:t>
@@ -2355,7 +2521,7 @@
       <w:bookmarkEnd w:id="5"/>
       <w:bookmarkEnd w:id="6"/>
     </w:p>
-    <w:p>
+    <w:p xmlns:wp14="http://schemas.microsoft.com/office/word/2010/wordml" wp14:textId="77777777">
       <w:pPr>
         <w:pStyle w:val="Normal"/>
         <w:rPr>
@@ -2382,26 +2548,26 @@
           <w:bottom w:w="0" w:type="dxa"/>
           <w:end w:w="108" w:type="dxa"/>
         </w:tblCellMar>
-        <w:tblLook w:val="04a0" w:firstRow="1" w:noVBand="1" w:lastRow="0" w:firstColumn="1" w:lastColumn="0" w:noHBand="0"/>
+        <w:tblLook w:val="04a0" w:firstRow="1" w:lastRow="0" w:firstColumn="1" w:lastColumn="0" w:noHBand="0" w:noVBand="1"/>
       </w:tblPr>
       <w:tblGrid>
         <w:gridCol w:w="1628"/>
         <w:gridCol w:w="4722"/>
       </w:tblGrid>
-      <w:tr>
+      <w:tr xmlns:wp14="http://schemas.microsoft.com/office/word/2010/wordml" wp14:textId="77777777">
         <w:trPr/>
         <w:tc>
           <w:tcPr>
             <w:tcW w:w="1628" w:type="dxa"/>
             <w:tcBorders>
-              <w:top w:val="single" w:sz="4" w:space="0" w:color="000000"/>
-              <w:start w:val="single" w:sz="4" w:space="0" w:color="000000"/>
-              <w:bottom w:val="single" w:sz="4" w:space="0" w:color="000000"/>
-              <w:end w:val="single" w:sz="4" w:space="0" w:color="000000"/>
+              <w:top w:val="single" w:color="000000" w:sz="4" w:space="0"/>
+              <w:start w:val="single" w:color="000000" w:sz="4" w:space="0"/>
+              <w:bottom w:val="single" w:color="000000" w:sz="4" w:space="0"/>
+              <w:end w:val="single" w:color="000000" w:sz="4" w:space="0"/>
             </w:tcBorders>
-            <w:shd w:color="auto" w:fill="BFBFBF" w:val="clear"/>
+            <w:shd w:val="clear" w:color="auto" w:fill="BFBFBF"/>
           </w:tcPr>
-          <w:p>
+          <w:p wp14:textId="77777777">
             <w:pPr>
               <w:pStyle w:val="Normal"/>
               <w:spacing w:before="0" w:after="160"/>
@@ -2423,14 +2589,14 @@
           <w:tcPr>
             <w:tcW w:w="4722" w:type="dxa"/>
             <w:tcBorders>
-              <w:top w:val="single" w:sz="4" w:space="0" w:color="000000"/>
-              <w:start w:val="single" w:sz="4" w:space="0" w:color="000000"/>
-              <w:bottom w:val="single" w:sz="4" w:space="0" w:color="000000"/>
-              <w:end w:val="single" w:sz="4" w:space="0" w:color="000000"/>
+              <w:top w:val="single" w:color="000000" w:sz="4" w:space="0"/>
+              <w:start w:val="single" w:color="000000" w:sz="4" w:space="0"/>
+              <w:bottom w:val="single" w:color="000000" w:sz="4" w:space="0"/>
+              <w:end w:val="single" w:color="000000" w:sz="4" w:space="0"/>
             </w:tcBorders>
-            <w:shd w:color="auto" w:fill="BFBFBF" w:val="clear"/>
+            <w:shd w:val="clear" w:color="auto" w:fill="BFBFBF"/>
           </w:tcPr>
-          <w:p>
+          <w:p wp14:textId="77777777">
             <w:pPr>
               <w:pStyle w:val="Normal"/>
               <w:spacing w:before="0" w:after="160"/>
@@ -2449,24 +2615,24 @@
           </w:p>
         </w:tc>
       </w:tr>
-      <w:tr>
+      <w:tr xmlns:wp14="http://schemas.microsoft.com/office/word/2010/wordml" wp14:textId="77777777">
         <w:trPr/>
         <w:tc>
           <w:tcPr>
             <w:tcW w:w="1628" w:type="dxa"/>
             <w:tcBorders>
-              <w:top w:val="single" w:sz="4" w:space="0" w:color="000000"/>
-              <w:start w:val="single" w:sz="4" w:space="0" w:color="000000"/>
-              <w:bottom w:val="single" w:sz="4" w:space="0" w:color="000000"/>
-              <w:end w:val="single" w:sz="4" w:space="0" w:color="000000"/>
+              <w:top w:val="single" w:color="000000" w:sz="4" w:space="0"/>
+              <w:start w:val="single" w:color="000000" w:sz="4" w:space="0"/>
+              <w:bottom w:val="single" w:color="000000" w:sz="4" w:space="0"/>
+              <w:end w:val="single" w:color="000000" w:sz="4" w:space="0"/>
             </w:tcBorders>
           </w:tcPr>
-          <w:p>
+          <w:p wp14:textId="77777777">
             <w:pPr>
               <w:pStyle w:val="Normal"/>
               <w:widowControl/>
               <w:bidi w:val="0"/>
-              <w:spacing w:lineRule="auto" w:line="259" w:before="0" w:after="160"/>
+              <w:spacing w:before="0" w:after="160" w:line="259" w:lineRule="auto"/>
               <w:jc w:val="start"/>
               <w:rPr/>
             </w:pPr>
@@ -2480,18 +2646,18 @@
           <w:tcPr>
             <w:tcW w:w="4722" w:type="dxa"/>
             <w:tcBorders>
-              <w:top w:val="single" w:sz="4" w:space="0" w:color="000000"/>
-              <w:start w:val="single" w:sz="4" w:space="0" w:color="000000"/>
-              <w:bottom w:val="single" w:sz="4" w:space="0" w:color="000000"/>
-              <w:end w:val="single" w:sz="4" w:space="0" w:color="000000"/>
+              <w:top w:val="single" w:color="000000" w:sz="4" w:space="0"/>
+              <w:start w:val="single" w:color="000000" w:sz="4" w:space="0"/>
+              <w:bottom w:val="single" w:color="000000" w:sz="4" w:space="0"/>
+              <w:end w:val="single" w:color="000000" w:sz="4" w:space="0"/>
             </w:tcBorders>
           </w:tcPr>
-          <w:p>
+          <w:p wp14:textId="77777777">
             <w:pPr>
               <w:pStyle w:val="Normal"/>
               <w:widowControl/>
               <w:bidi w:val="0"/>
-              <w:spacing w:lineRule="auto" w:line="259" w:before="0" w:after="160"/>
+              <w:spacing w:before="0" w:after="160" w:line="259" w:lineRule="auto"/>
               <w:jc w:val="start"/>
               <w:rPr/>
             </w:pPr>
@@ -2502,24 +2668,24 @@
           </w:p>
         </w:tc>
       </w:tr>
-      <w:tr>
+      <w:tr xmlns:wp14="http://schemas.microsoft.com/office/word/2010/wordml" wp14:textId="77777777">
         <w:trPr/>
         <w:tc>
           <w:tcPr>
             <w:tcW w:w="1628" w:type="dxa"/>
             <w:tcBorders>
-              <w:top w:val="single" w:sz="4" w:space="0" w:color="000000"/>
-              <w:start w:val="single" w:sz="4" w:space="0" w:color="000000"/>
-              <w:bottom w:val="single" w:sz="4" w:space="0" w:color="000000"/>
-              <w:end w:val="single" w:sz="4" w:space="0" w:color="000000"/>
+              <w:top w:val="single" w:color="000000" w:sz="4" w:space="0"/>
+              <w:start w:val="single" w:color="000000" w:sz="4" w:space="0"/>
+              <w:bottom w:val="single" w:color="000000" w:sz="4" w:space="0"/>
+              <w:end w:val="single" w:color="000000" w:sz="4" w:space="0"/>
             </w:tcBorders>
           </w:tcPr>
-          <w:p>
+          <w:p wp14:textId="77777777">
             <w:pPr>
               <w:pStyle w:val="Normal"/>
               <w:widowControl/>
               <w:bidi w:val="0"/>
-              <w:spacing w:lineRule="auto" w:line="259" w:before="0" w:after="160"/>
+              <w:spacing w:before="0" w:after="160" w:line="259" w:lineRule="auto"/>
               <w:jc w:val="start"/>
               <w:rPr/>
             </w:pPr>
@@ -2533,18 +2699,18 @@
           <w:tcPr>
             <w:tcW w:w="4722" w:type="dxa"/>
             <w:tcBorders>
-              <w:top w:val="single" w:sz="4" w:space="0" w:color="000000"/>
-              <w:start w:val="single" w:sz="4" w:space="0" w:color="000000"/>
-              <w:bottom w:val="single" w:sz="4" w:space="0" w:color="000000"/>
-              <w:end w:val="single" w:sz="4" w:space="0" w:color="000000"/>
+              <w:top w:val="single" w:color="000000" w:sz="4" w:space="0"/>
+              <w:start w:val="single" w:color="000000" w:sz="4" w:space="0"/>
+              <w:bottom w:val="single" w:color="000000" w:sz="4" w:space="0"/>
+              <w:end w:val="single" w:color="000000" w:sz="4" w:space="0"/>
             </w:tcBorders>
           </w:tcPr>
-          <w:p>
+          <w:p wp14:textId="77777777">
             <w:pPr>
               <w:pStyle w:val="Normal"/>
               <w:widowControl/>
               <w:bidi w:val="0"/>
-              <w:spacing w:lineRule="auto" w:line="259" w:before="0" w:after="160"/>
+              <w:spacing w:before="0" w:after="160" w:line="259" w:lineRule="auto"/>
               <w:jc w:val="start"/>
               <w:rPr/>
             </w:pPr>
@@ -2555,24 +2721,24 @@
           </w:p>
         </w:tc>
       </w:tr>
-      <w:tr>
+      <w:tr xmlns:wp14="http://schemas.microsoft.com/office/word/2010/wordml" wp14:textId="77777777">
         <w:trPr/>
         <w:tc>
           <w:tcPr>
             <w:tcW w:w="1628" w:type="dxa"/>
             <w:tcBorders>
-              <w:top w:val="single" w:sz="4" w:space="0" w:color="000000"/>
-              <w:start w:val="single" w:sz="4" w:space="0" w:color="000000"/>
-              <w:bottom w:val="single" w:sz="4" w:space="0" w:color="000000"/>
-              <w:end w:val="single" w:sz="4" w:space="0" w:color="000000"/>
+              <w:top w:val="single" w:color="000000" w:sz="4" w:space="0"/>
+              <w:start w:val="single" w:color="000000" w:sz="4" w:space="0"/>
+              <w:bottom w:val="single" w:color="000000" w:sz="4" w:space="0"/>
+              <w:end w:val="single" w:color="000000" w:sz="4" w:space="0"/>
             </w:tcBorders>
           </w:tcPr>
-          <w:p>
+          <w:p wp14:textId="77777777">
             <w:pPr>
               <w:pStyle w:val="Normal"/>
               <w:widowControl/>
               <w:bidi w:val="0"/>
-              <w:spacing w:lineRule="auto" w:line="259" w:before="0" w:after="160"/>
+              <w:spacing w:before="0" w:after="160" w:line="259" w:lineRule="auto"/>
               <w:jc w:val="start"/>
               <w:rPr/>
             </w:pPr>
@@ -2586,18 +2752,18 @@
           <w:tcPr>
             <w:tcW w:w="4722" w:type="dxa"/>
             <w:tcBorders>
-              <w:top w:val="single" w:sz="4" w:space="0" w:color="000000"/>
-              <w:start w:val="single" w:sz="4" w:space="0" w:color="000000"/>
-              <w:bottom w:val="single" w:sz="4" w:space="0" w:color="000000"/>
-              <w:end w:val="single" w:sz="4" w:space="0" w:color="000000"/>
+              <w:top w:val="single" w:color="000000" w:sz="4" w:space="0"/>
+              <w:start w:val="single" w:color="000000" w:sz="4" w:space="0"/>
+              <w:bottom w:val="single" w:color="000000" w:sz="4" w:space="0"/>
+              <w:end w:val="single" w:color="000000" w:sz="4" w:space="0"/>
             </w:tcBorders>
           </w:tcPr>
-          <w:p>
+          <w:p wp14:textId="77777777">
             <w:pPr>
               <w:pStyle w:val="Normal"/>
               <w:widowControl/>
               <w:bidi w:val="0"/>
-              <w:spacing w:lineRule="auto" w:line="259" w:before="0" w:after="160"/>
+              <w:spacing w:before="0" w:after="160" w:line="259" w:lineRule="auto"/>
               <w:jc w:val="start"/>
               <w:rPr/>
             </w:pPr>
@@ -2608,24 +2774,24 @@
           </w:p>
         </w:tc>
       </w:tr>
-      <w:tr>
+      <w:tr xmlns:wp14="http://schemas.microsoft.com/office/word/2010/wordml" wp14:textId="77777777">
         <w:trPr/>
         <w:tc>
           <w:tcPr>
             <w:tcW w:w="1628" w:type="dxa"/>
             <w:tcBorders>
-              <w:top w:val="single" w:sz="4" w:space="0" w:color="000000"/>
-              <w:start w:val="single" w:sz="4" w:space="0" w:color="000000"/>
-              <w:bottom w:val="single" w:sz="4" w:space="0" w:color="000000"/>
-              <w:end w:val="single" w:sz="4" w:space="0" w:color="000000"/>
+              <w:top w:val="single" w:color="000000" w:sz="4" w:space="0"/>
+              <w:start w:val="single" w:color="000000" w:sz="4" w:space="0"/>
+              <w:bottom w:val="single" w:color="000000" w:sz="4" w:space="0"/>
+              <w:end w:val="single" w:color="000000" w:sz="4" w:space="0"/>
             </w:tcBorders>
           </w:tcPr>
-          <w:p>
+          <w:p wp14:textId="77777777">
             <w:pPr>
               <w:pStyle w:val="Normal"/>
               <w:widowControl/>
               <w:bidi w:val="0"/>
-              <w:spacing w:lineRule="auto" w:line="259" w:before="0" w:after="160"/>
+              <w:spacing w:before="0" w:after="160" w:line="259" w:lineRule="auto"/>
               <w:jc w:val="start"/>
               <w:rPr/>
             </w:pPr>
@@ -2639,18 +2805,18 @@
           <w:tcPr>
             <w:tcW w:w="4722" w:type="dxa"/>
             <w:tcBorders>
-              <w:top w:val="single" w:sz="4" w:space="0" w:color="000000"/>
-              <w:start w:val="single" w:sz="4" w:space="0" w:color="000000"/>
-              <w:bottom w:val="single" w:sz="4" w:space="0" w:color="000000"/>
-              <w:end w:val="single" w:sz="4" w:space="0" w:color="000000"/>
+              <w:top w:val="single" w:color="000000" w:sz="4" w:space="0"/>
+              <w:start w:val="single" w:color="000000" w:sz="4" w:space="0"/>
+              <w:bottom w:val="single" w:color="000000" w:sz="4" w:space="0"/>
+              <w:end w:val="single" w:color="000000" w:sz="4" w:space="0"/>
             </w:tcBorders>
           </w:tcPr>
-          <w:p>
+          <w:p wp14:textId="77777777">
             <w:pPr>
               <w:pStyle w:val="Normal"/>
               <w:widowControl/>
               <w:bidi w:val="0"/>
-              <w:spacing w:lineRule="auto" w:line="259" w:before="0" w:after="160"/>
+              <w:spacing w:before="0" w:after="160" w:line="259" w:lineRule="auto"/>
               <w:jc w:val="start"/>
               <w:rPr/>
             </w:pPr>
@@ -2662,29 +2828,29 @@
         </w:tc>
       </w:tr>
     </w:tbl>
-    <w:p>
-      <w:pPr>
-        <w:pStyle w:val="Normal"/>
-        <w:rPr/>
-      </w:pPr>
-      <w:r>
-        <w:rPr/>
-      </w:r>
-    </w:p>
-    <w:p>
-      <w:pPr>
-        <w:pStyle w:val="Normal"/>
-        <w:rPr>
-          <w:rFonts w:ascii="Calibri Light" w:hAnsi="Calibri Light" w:eastAsia="" w:cs="" w:asciiTheme="majorHAnsi" w:cstheme="majorBidi" w:eastAsiaTheme="majorEastAsia" w:hAnsiTheme="majorHAnsi"/>
-          <w:color w:themeColor="accent1" w:themeShade="bf" w:val="2F5496"/>
+    <w:p xmlns:wp14="http://schemas.microsoft.com/office/word/2010/wordml" wp14:textId="77777777">
+      <w:pPr>
+        <w:pStyle w:val="Normal"/>
+        <w:rPr/>
+      </w:pPr>
+      <w:r>
+        <w:rPr/>
+      </w:r>
+    </w:p>
+    <w:p xmlns:wp14="http://schemas.microsoft.com/office/word/2010/wordml" wp14:textId="77777777">
+      <w:pPr>
+        <w:pStyle w:val="Normal"/>
+        <w:rPr>
+          <w:rFonts w:ascii="Calibri Light" w:hAnsi="Calibri Light" w:eastAsia="" w:cs="" w:asciiTheme="majorHAnsi" w:hAnsiTheme="majorHAnsi" w:eastAsiaTheme="majorEastAsia" w:cstheme="majorBidi"/>
+          <w:color w:val="2F5496" w:themeColor="accent1" w:themeShade="bf"/>
           <w:sz w:val="32"/>
           <w:szCs w:val="32"/>
         </w:rPr>
       </w:pPr>
       <w:r>
         <w:rPr>
-          <w:rFonts w:eastAsia="" w:cs="" w:cstheme="majorBidi" w:eastAsiaTheme="majorEastAsia" w:ascii="Calibri Light" w:hAnsi="Calibri Light"/>
-          <w:color w:themeColor="accent1" w:themeShade="bf" w:val="2F5496"/>
+          <w:rFonts w:ascii="Calibri Light" w:hAnsi="Calibri Light" w:eastAsia="" w:cs="" w:eastAsiaTheme="majorEastAsia" w:cstheme="majorBidi"/>
+          <w:color w:val="2F5496" w:themeColor="accent1" w:themeShade="bf"/>
           <w:sz w:val="32"/>
           <w:szCs w:val="32"/>
         </w:rPr>
@@ -2693,32 +2859,32 @@
         <w:br w:type="page"/>
       </w:r>
     </w:p>
-    <w:p>
+    <w:p xmlns:wp14="http://schemas.microsoft.com/office/word/2010/wordml" wp14:textId="77777777">
       <w:pPr>
         <w:pStyle w:val="Heading1"/>
         <w:spacing w:before="0" w:after="0"/>
         <w:rPr/>
       </w:pPr>
-      <w:bookmarkStart w:id="7" w:name="_Toc183096221"/>
+      <w:bookmarkStart w:name="_Toc183096221" w:id="7"/>
       <w:r>
         <w:rPr/>
         <w:t>Game Elements</w:t>
       </w:r>
       <w:bookmarkEnd w:id="7"/>
     </w:p>
-    <w:p>
+    <w:p xmlns:wp14="http://schemas.microsoft.com/office/word/2010/wordml" wp14:textId="77777777">
       <w:pPr>
         <w:pStyle w:val="Heading2"/>
         <w:rPr/>
       </w:pPr>
-      <w:bookmarkStart w:id="8" w:name="_Toc164756212"/>
+      <w:bookmarkStart w:name="_Toc164756212" w:id="8"/>
       <w:r>
         <w:rPr/>
         <w:t>Key Features</w:t>
       </w:r>
       <w:bookmarkEnd w:id="8"/>
     </w:p>
-    <w:p>
+    <w:p xmlns:wp14="http://schemas.microsoft.com/office/word/2010/wordml" wp14:textId="77777777">
       <w:pPr>
         <w:pStyle w:val="Normal"/>
         <w:rPr/>
@@ -2730,29 +2896,53 @@
       <w:r>
         <w:rPr/>
         <w:t>Physics-tool: objecten op afstand selecteren, oppakken, verplaatsen, draaien en wegschieten.</w:t>
+      </w:r>
+      <w:r>
+        <w:rPr/>
         <w:br/>
+      </w:r>
+      <w:r>
+        <w:rPr/>
         <w:t>• Physics-puzzels: de speler gebruikt zwaartekracht, massa, momentum en botsingen om verder te komen.</w:t>
+      </w:r>
+      <w:r>
+        <w:rPr/>
         <w:br/>
+      </w:r>
+      <w:r>
+        <w:rPr/>
         <w:t>• Interactieve 3D-omgeving: losse objecten reageren fysiek op de speler en op elkaar.</w:t>
+      </w:r>
+      <w:r>
+        <w:rPr/>
         <w:br/>
+      </w:r>
+      <w:r>
+        <w:rPr/>
         <w:t>• Geleidelijke moeilijkheid: functies van de tool worden eerst afzonderlijk aangeleerd en later gecombineerd in moeilijkere puzzels.</w:t>
+      </w:r>
+      <w:r>
+        <w:rPr/>
         <w:br/>
+      </w:r>
+      <w:r>
+        <w:rPr/>
         <w:t>• Experimenteren: puzzels moeten ruimte bieden om verschillende objecten en natuurkundige eigenschappen uit te proberen.</w:t>
       </w:r>
     </w:p>
-    <w:p>
+    <w:p xmlns:wp14="http://schemas.microsoft.com/office/word/2010/wordml" wp14:textId="77777777">
       <w:pPr>
         <w:pStyle w:val="Heading2"/>
         <w:rPr/>
       </w:pPr>
-      <w:bookmarkStart w:id="9" w:name="_Toc164756213"/>
+      <w:bookmarkStart w:name="_Toc164756213" w:id="9"/>
       <w:r>
         <w:rPr/>
         <w:t>Game Mechanics</w:t>
       </w:r>
       <w:bookmarkEnd w:id="9"/>
     </w:p>
-    <w:p>
+    <w:p xmlns:wp14="http://schemas.microsoft.com/office/word/2010/wordml" wp14:textId="77777777">
       <w:pPr>
         <w:pStyle w:val="Normal"/>
         <w:rPr/>
@@ -2762,31 +2952,31 @@
         <w:t>De speler selecteert objecten met raycasting vanuit de camera. Interactieve objecten gebruiken een Rigidbody en Collider, zodat zwaartekracht, massa, snelheid en botsingen kunnen worden berekend. Terwijl een object wordt vastgehouden kan het worden verplaatst en gedraaid. Bij het wegschieten wordt via C# een kracht op de Rigidbody toegepast. De massa van het object heeft invloed op hoe het object reageert. Deze mechanics vormen samen de basis voor de puzzels.</w:t>
       </w:r>
     </w:p>
-    <w:p>
-      <w:pPr>
-        <w:pStyle w:val="Normal"/>
-        <w:rPr/>
-      </w:pPr>
-      <w:r>
-        <w:rPr/>
-      </w:r>
-    </w:p>
-    <w:p>
-      <w:pPr>
-        <w:pStyle w:val="Normal"/>
-        <w:rPr>
-          <w:rFonts w:ascii="Calibri Light" w:hAnsi="Calibri Light" w:eastAsia="" w:cs="" w:asciiTheme="majorHAnsi" w:cstheme="majorBidi" w:eastAsiaTheme="majorEastAsia" w:hAnsiTheme="majorHAnsi"/>
+    <w:p xmlns:wp14="http://schemas.microsoft.com/office/word/2010/wordml" wp14:textId="77777777">
+      <w:pPr>
+        <w:pStyle w:val="Normal"/>
+        <w:rPr/>
+      </w:pPr>
+      <w:r>
+        <w:rPr/>
+      </w:r>
+    </w:p>
+    <w:p xmlns:wp14="http://schemas.microsoft.com/office/word/2010/wordml" wp14:textId="77777777">
+      <w:pPr>
+        <w:pStyle w:val="Normal"/>
+        <w:rPr>
+          <w:rFonts w:ascii="Calibri Light" w:hAnsi="Calibri Light" w:eastAsia="" w:cs="" w:asciiTheme="majorHAnsi" w:hAnsiTheme="majorHAnsi" w:eastAsiaTheme="majorEastAsia" w:cstheme="majorBidi"/>
           <w:b/>
-          <w:color w:themeColor="accent1" w:themeShade="bf" w:val="2F5496"/>
+          <w:color w:val="2F5496" w:themeColor="accent1" w:themeShade="bf"/>
           <w:sz w:val="44"/>
           <w:szCs w:val="32"/>
         </w:rPr>
       </w:pPr>
       <w:r>
         <w:rPr>
-          <w:rFonts w:eastAsia="" w:cs="" w:cstheme="majorBidi" w:eastAsiaTheme="majorEastAsia" w:ascii="Calibri Light" w:hAnsi="Calibri Light"/>
+          <w:rFonts w:ascii="Calibri Light" w:hAnsi="Calibri Light" w:eastAsia="" w:cs="" w:eastAsiaTheme="majorEastAsia" w:cstheme="majorBidi"/>
           <w:b/>
-          <w:color w:themeColor="accent1" w:themeShade="bf" w:val="2F5496"/>
+          <w:color w:val="2F5496" w:themeColor="accent1" w:themeShade="bf"/>
           <w:sz w:val="44"/>
           <w:szCs w:val="32"/>
         </w:rPr>
@@ -2795,32 +2985,32 @@
         <w:br w:type="page"/>
       </w:r>
     </w:p>
-    <w:p>
+    <w:p xmlns:wp14="http://schemas.microsoft.com/office/word/2010/wordml" wp14:textId="77777777">
       <w:pPr>
         <w:pStyle w:val="Heading1"/>
         <w:spacing w:before="0" w:after="0"/>
         <w:rPr/>
       </w:pPr>
-      <w:bookmarkStart w:id="10" w:name="_Toc183096222"/>
+      <w:bookmarkStart w:name="_Toc183096222" w:id="10"/>
       <w:r>
         <w:rPr/>
         <w:t>Speler Beweging</w:t>
       </w:r>
       <w:bookmarkEnd w:id="10"/>
     </w:p>
-    <w:p>
+    <w:p xmlns:wp14="http://schemas.microsoft.com/office/word/2010/wordml" wp14:textId="77777777">
       <w:pPr>
         <w:pStyle w:val="Heading2"/>
         <w:rPr/>
       </w:pPr>
-      <w:bookmarkStart w:id="11" w:name="_Toc164756225"/>
+      <w:bookmarkStart w:name="_Toc164756225" w:id="11"/>
       <w:r>
         <w:rPr/>
         <w:t>Standaard Beweging(en)</w:t>
       </w:r>
       <w:bookmarkEnd w:id="11"/>
     </w:p>
-    <w:p>
+    <w:p xmlns:wp14="http://schemas.microsoft.com/office/word/2010/wordml" wp14:textId="77777777">
       <w:pPr>
         <w:pStyle w:val="Normal"/>
         <w:rPr/>
@@ -2830,19 +3020,19 @@
         <w:t>De speler beweegt met standaard first-person besturing: vooruit, achteruit en zijwaarts lopen, rondkijken met de muis en springen. De besturing moet eenvoudig blijven, zodat de aandacht vooral bij de physics-puzzels ligt.</w:t>
       </w:r>
     </w:p>
-    <w:p>
+    <w:p xmlns:wp14="http://schemas.microsoft.com/office/word/2010/wordml" wp14:textId="77777777">
       <w:pPr>
         <w:pStyle w:val="Heading2"/>
         <w:rPr/>
       </w:pPr>
-      <w:bookmarkStart w:id="12" w:name="_Toc164756226"/>
+      <w:bookmarkStart w:name="_Toc164756226" w:id="12"/>
       <w:r>
         <w:rPr/>
         <w:t>Speciale Beweging(en)</w:t>
       </w:r>
       <w:bookmarkEnd w:id="12"/>
     </w:p>
-    <w:p>
+    <w:p xmlns:wp14="http://schemas.microsoft.com/office/word/2010/wordml" wp14:textId="77777777">
       <w:pPr>
         <w:pStyle w:val="Normal"/>
         <w:rPr/>
@@ -2852,22 +3042,22 @@
         <w:t>Er zijn voor het proof of concept geen speciale bewegingsopties nodig. Het bereiken van moeilijk toegankelijke plekken gebeurt vooral door de omgeving en physics-objecten slim te gebruiken.</w:t>
       </w:r>
     </w:p>
-    <w:p>
-      <w:pPr>
-        <w:pStyle w:val="Normal"/>
-        <w:rPr>
-          <w:rFonts w:ascii="Calibri Light" w:hAnsi="Calibri Light" w:eastAsia="" w:cs="" w:asciiTheme="majorHAnsi" w:cstheme="majorBidi" w:eastAsiaTheme="majorEastAsia" w:hAnsiTheme="majorHAnsi"/>
+    <w:p xmlns:wp14="http://schemas.microsoft.com/office/word/2010/wordml" wp14:textId="77777777">
+      <w:pPr>
+        <w:pStyle w:val="Normal"/>
+        <w:rPr>
+          <w:rFonts w:ascii="Calibri Light" w:hAnsi="Calibri Light" w:eastAsia="" w:cs="" w:asciiTheme="majorHAnsi" w:hAnsiTheme="majorHAnsi" w:eastAsiaTheme="majorEastAsia" w:cstheme="majorBidi"/>
           <w:b/>
-          <w:color w:themeColor="accent1" w:themeShade="bf" w:val="2F5496"/>
+          <w:color w:val="2F5496" w:themeColor="accent1" w:themeShade="bf"/>
           <w:sz w:val="44"/>
           <w:szCs w:val="32"/>
         </w:rPr>
       </w:pPr>
       <w:r>
         <w:rPr>
-          <w:rFonts w:eastAsia="" w:cs="" w:cstheme="majorBidi" w:eastAsiaTheme="majorEastAsia" w:ascii="Calibri Light" w:hAnsi="Calibri Light"/>
+          <w:rFonts w:ascii="Calibri Light" w:hAnsi="Calibri Light" w:eastAsia="" w:cs="" w:eastAsiaTheme="majorEastAsia" w:cstheme="majorBidi"/>
           <w:b/>
-          <w:color w:themeColor="accent1" w:themeShade="bf" w:val="2F5496"/>
+          <w:color w:val="2F5496" w:themeColor="accent1" w:themeShade="bf"/>
           <w:sz w:val="44"/>
           <w:szCs w:val="32"/>
         </w:rPr>
@@ -2876,32 +3066,32 @@
         <w:br w:type="page"/>
       </w:r>
     </w:p>
-    <w:p>
+    <w:p xmlns:wp14="http://schemas.microsoft.com/office/word/2010/wordml" wp14:textId="77777777">
       <w:pPr>
         <w:pStyle w:val="Heading1"/>
         <w:spacing w:before="0" w:after="0"/>
         <w:rPr/>
       </w:pPr>
-      <w:bookmarkStart w:id="13" w:name="_Toc183096223"/>
+      <w:bookmarkStart w:name="_Toc183096223" w:id="13"/>
       <w:r>
         <w:rPr/>
         <w:t>Vijanden (indien nodig)</w:t>
       </w:r>
       <w:bookmarkEnd w:id="13"/>
     </w:p>
-    <w:p>
+    <w:p xmlns:wp14="http://schemas.microsoft.com/office/word/2010/wordml" wp14:textId="77777777">
       <w:pPr>
         <w:pStyle w:val="Heading2"/>
         <w:rPr/>
       </w:pPr>
-      <w:bookmarkStart w:id="14" w:name="_Toc164756228"/>
+      <w:bookmarkStart w:name="_Toc164756228" w:id="14"/>
       <w:r>
         <w:rPr/>
         <w:t>Gedragingen/ AI</w:t>
       </w:r>
       <w:bookmarkEnd w:id="14"/>
     </w:p>
-    <w:p>
+    <w:p xmlns:wp14="http://schemas.microsoft.com/office/word/2010/wordml" wp14:textId="77777777">
       <w:pPr>
         <w:pStyle w:val="Normal"/>
         <w:rPr/>
@@ -2911,19 +3101,19 @@
         <w:t>Niet van toepassing. Vijanden en AI zijn geen onderdeel van het huidige proof of concept; de focus ligt op physics en puzzels.</w:t>
       </w:r>
     </w:p>
-    <w:p>
+    <w:p xmlns:wp14="http://schemas.microsoft.com/office/word/2010/wordml" wp14:textId="77777777">
       <w:pPr>
         <w:pStyle w:val="Heading2"/>
         <w:rPr/>
       </w:pPr>
-      <w:bookmarkStart w:id="15" w:name="_Toc164756229"/>
+      <w:bookmarkStart w:name="_Toc164756229" w:id="15"/>
       <w:r>
         <w:rPr/>
         <w:t>Types</w:t>
       </w:r>
       <w:bookmarkEnd w:id="15"/>
     </w:p>
-    <w:p>
+    <w:p xmlns:wp14="http://schemas.microsoft.com/office/word/2010/wordml" wp14:textId="77777777">
       <w:pPr>
         <w:pStyle w:val="Normal"/>
         <w:rPr/>
@@ -2933,19 +3123,19 @@
         <w:t>Niet van toepassing.</w:t>
       </w:r>
     </w:p>
-    <w:p>
+    <w:p xmlns:wp14="http://schemas.microsoft.com/office/word/2010/wordml" wp14:textId="77777777">
       <w:pPr>
         <w:pStyle w:val="Heading2"/>
         <w:rPr/>
       </w:pPr>
-      <w:bookmarkStart w:id="16" w:name="_Toc164756230"/>
+      <w:bookmarkStart w:name="_Toc164756230" w:id="16"/>
       <w:r>
         <w:rPr/>
         <w:t>Acties</w:t>
       </w:r>
       <w:bookmarkEnd w:id="16"/>
     </w:p>
-    <w:p>
+    <w:p xmlns:wp14="http://schemas.microsoft.com/office/word/2010/wordml" wp14:textId="77777777">
       <w:pPr>
         <w:pStyle w:val="Normal"/>
         <w:rPr/>
@@ -2955,19 +3145,19 @@
         <w:t>Niet van toepassing.</w:t>
       </w:r>
     </w:p>
-    <w:p>
+    <w:p xmlns:wp14="http://schemas.microsoft.com/office/word/2010/wordml" wp14:textId="77777777">
       <w:pPr>
         <w:pStyle w:val="Heading2"/>
         <w:rPr/>
       </w:pPr>
-      <w:bookmarkStart w:id="17" w:name="_Toc164756231"/>
+      <w:bookmarkStart w:name="_Toc164756231" w:id="17"/>
       <w:r>
         <w:rPr/>
         <w:t>Stuurpuls(Triggers zoals zicht en/of geluid)</w:t>
       </w:r>
       <w:bookmarkEnd w:id="17"/>
     </w:p>
-    <w:p>
+    <w:p xmlns:wp14="http://schemas.microsoft.com/office/word/2010/wordml" wp14:textId="77777777">
       <w:pPr>
         <w:pStyle w:val="Normal"/>
         <w:rPr/>
@@ -2977,19 +3167,19 @@
         <w:t>Niet van toepassing.</w:t>
       </w:r>
     </w:p>
-    <w:p>
+    <w:p xmlns:wp14="http://schemas.microsoft.com/office/word/2010/wordml" wp14:textId="77777777">
       <w:pPr>
         <w:pStyle w:val="Heading2"/>
         <w:rPr/>
       </w:pPr>
-      <w:bookmarkStart w:id="18" w:name="_Toc164756232"/>
+      <w:bookmarkStart w:name="_Toc164756232" w:id="18"/>
       <w:r>
         <w:rPr/>
         <w:t>Beweging</w:t>
       </w:r>
       <w:bookmarkEnd w:id="18"/>
     </w:p>
-    <w:p>
+    <w:p xmlns:wp14="http://schemas.microsoft.com/office/word/2010/wordml" wp14:textId="77777777">
       <w:pPr>
         <w:pStyle w:val="Normal"/>
         <w:rPr/>
@@ -2999,31 +3189,31 @@
         <w:t>Niet van toepassing.</w:t>
       </w:r>
     </w:p>
-    <w:p>
-      <w:pPr>
-        <w:pStyle w:val="Normal"/>
-        <w:rPr/>
-      </w:pPr>
-      <w:r>
-        <w:rPr/>
-      </w:r>
-    </w:p>
-    <w:p>
-      <w:pPr>
-        <w:pStyle w:val="Normal"/>
-        <w:rPr>
-          <w:rFonts w:ascii="Calibri Light" w:hAnsi="Calibri Light" w:eastAsia="" w:cs="" w:asciiTheme="majorHAnsi" w:cstheme="majorBidi" w:eastAsiaTheme="majorEastAsia" w:hAnsiTheme="majorHAnsi"/>
+    <w:p xmlns:wp14="http://schemas.microsoft.com/office/word/2010/wordml" wp14:textId="77777777">
+      <w:pPr>
+        <w:pStyle w:val="Normal"/>
+        <w:rPr/>
+      </w:pPr>
+      <w:r>
+        <w:rPr/>
+      </w:r>
+    </w:p>
+    <w:p xmlns:wp14="http://schemas.microsoft.com/office/word/2010/wordml" wp14:textId="77777777">
+      <w:pPr>
+        <w:pStyle w:val="Normal"/>
+        <w:rPr>
+          <w:rFonts w:ascii="Calibri Light" w:hAnsi="Calibri Light" w:eastAsia="" w:cs="" w:asciiTheme="majorHAnsi" w:hAnsiTheme="majorHAnsi" w:eastAsiaTheme="majorEastAsia" w:cstheme="majorBidi"/>
           <w:b/>
-          <w:color w:themeColor="accent1" w:themeShade="bf" w:val="2F5496"/>
+          <w:color w:val="2F5496" w:themeColor="accent1" w:themeShade="bf"/>
           <w:sz w:val="44"/>
           <w:szCs w:val="32"/>
         </w:rPr>
       </w:pPr>
       <w:r>
         <w:rPr>
-          <w:rFonts w:eastAsia="" w:cs="" w:cstheme="majorBidi" w:eastAsiaTheme="majorEastAsia" w:ascii="Calibri Light" w:hAnsi="Calibri Light"/>
+          <w:rFonts w:ascii="Calibri Light" w:hAnsi="Calibri Light" w:eastAsia="" w:cs="" w:eastAsiaTheme="majorEastAsia" w:cstheme="majorBidi"/>
           <w:b/>
-          <w:color w:themeColor="accent1" w:themeShade="bf" w:val="2F5496"/>
+          <w:color w:val="2F5496" w:themeColor="accent1" w:themeShade="bf"/>
           <w:sz w:val="44"/>
           <w:szCs w:val="32"/>
         </w:rPr>
@@ -3032,32 +3222,32 @@
         <w:br w:type="page"/>
       </w:r>
     </w:p>
-    <w:p>
+    <w:p xmlns:wp14="http://schemas.microsoft.com/office/word/2010/wordml" wp14:textId="77777777">
       <w:pPr>
         <w:pStyle w:val="Heading1"/>
         <w:spacing w:before="0" w:after="0"/>
         <w:rPr/>
       </w:pPr>
-      <w:bookmarkStart w:id="19" w:name="_Toc183096224"/>
+      <w:bookmarkStart w:name="_Toc183096224" w:id="19"/>
       <w:r>
         <w:rPr/>
         <w:t>User Interface</w:t>
       </w:r>
       <w:bookmarkEnd w:id="19"/>
     </w:p>
-    <w:p>
+    <w:p xmlns:wp14="http://schemas.microsoft.com/office/word/2010/wordml" wp14:textId="77777777">
       <w:pPr>
         <w:pStyle w:val="Heading2"/>
         <w:rPr/>
       </w:pPr>
-      <w:bookmarkStart w:id="20" w:name="_Toc164756235"/>
+      <w:bookmarkStart w:name="_Toc164756235" w:id="20"/>
       <w:r>
         <w:rPr/>
         <w:t>Menu Flow</w:t>
       </w:r>
       <w:bookmarkEnd w:id="20"/>
     </w:p>
-    <w:p>
+    <w:p xmlns:wp14="http://schemas.microsoft.com/office/word/2010/wordml" wp14:textId="77777777">
       <w:pPr>
         <w:pStyle w:val="Normal"/>
         <w:rPr/>
@@ -3067,19 +3257,19 @@
         <w:t>Hoofdmenu → Start spel → Physics-puzzels → Pauzemenu → Hervatten / Opnieuw starten / Terug naar hoofdmenu.</w:t>
       </w:r>
     </w:p>
-    <w:p>
+    <w:p xmlns:wp14="http://schemas.microsoft.com/office/word/2010/wordml" wp14:textId="77777777">
       <w:pPr>
         <w:pStyle w:val="Heading2"/>
         <w:rPr/>
       </w:pPr>
-      <w:bookmarkStart w:id="21" w:name="_Toc164756236"/>
+      <w:bookmarkStart w:name="_Toc164756236" w:id="21"/>
       <w:r>
         <w:rPr/>
         <w:t>Main Menu</w:t>
       </w:r>
       <w:bookmarkEnd w:id="21"/>
     </w:p>
-    <w:p>
+    <w:p xmlns:wp14="http://schemas.microsoft.com/office/word/2010/wordml" wp14:textId="77777777">
       <w:pPr>
         <w:pStyle w:val="Normal"/>
         <w:rPr/>
@@ -3089,7 +3279,7 @@
         <w:t>Een eenvoudig hoofdmenu met minimaal Start spel, Instellingen en Afsluiten. De interface blijft rustig zodat de industriële setting centraal staat.</w:t>
       </w:r>
     </w:p>
-    <w:p>
+    <w:p xmlns:wp14="http://schemas.microsoft.com/office/word/2010/wordml" wp14:textId="77777777">
       <w:pPr>
         <w:pStyle w:val="Heading2"/>
         <w:rPr/>
@@ -3099,7 +3289,7 @@
         <w:t>In Game Menu</w:t>
       </w:r>
     </w:p>
-    <w:p>
+    <w:p xmlns:wp14="http://schemas.microsoft.com/office/word/2010/wordml" wp14:textId="77777777">
       <w:pPr>
         <w:pStyle w:val="Normal"/>
         <w:rPr/>
@@ -3109,19 +3299,19 @@
         <w:t>Een pauzemenu met Hervatten, Puzzel/level opnieuw starten, Instellingen en Terug naar hoofdmenu. Tijdens het spelen blijft de HUD minimaal.</w:t>
       </w:r>
     </w:p>
-    <w:p>
+    <w:p xmlns:wp14="http://schemas.microsoft.com/office/word/2010/wordml" wp14:textId="77777777">
       <w:pPr>
         <w:pStyle w:val="Heading2"/>
         <w:rPr/>
       </w:pPr>
-      <w:bookmarkStart w:id="22" w:name="_Toc164756242"/>
+      <w:bookmarkStart w:name="_Toc164756242" w:id="22"/>
       <w:r>
         <w:rPr/>
         <w:t>Hints/ Tips</w:t>
       </w:r>
       <w:bookmarkEnd w:id="22"/>
     </w:p>
-    <w:p>
+    <w:p xmlns:wp14="http://schemas.microsoft.com/office/word/2010/wordml" wp14:textId="77777777">
       <w:pPr>
         <w:pStyle w:val="Normal"/>
         <w:rPr/>
@@ -3131,7 +3321,7 @@
         <w:t>Een kleine crosshair in het midden van het scherm helpt bij raycasting en het selecteren van objecten. Interactieve objecten krijgen duidelijke feedback wanneer ze geselecteerd kunnen worden. In het begin kunnen korte prompts de functies oppakken, draaien en wegschieten uitleggen.</w:t>
       </w:r>
     </w:p>
-    <w:p>
+    <w:p xmlns:wp14="http://schemas.microsoft.com/office/word/2010/wordml" wp14:textId="77777777">
       <w:pPr>
         <w:pStyle w:val="Heading3"/>
         <w:rPr/>
@@ -3140,22 +3330,22 @@
         <w:rPr/>
       </w:r>
     </w:p>
-    <w:p>
-      <w:pPr>
-        <w:pStyle w:val="Normal"/>
-        <w:rPr>
-          <w:rFonts w:ascii="Calibri Light" w:hAnsi="Calibri Light" w:eastAsia="" w:cs="" w:asciiTheme="majorHAnsi" w:cstheme="majorBidi" w:eastAsiaTheme="majorEastAsia" w:hAnsiTheme="majorHAnsi"/>
+    <w:p xmlns:wp14="http://schemas.microsoft.com/office/word/2010/wordml" wp14:textId="77777777">
+      <w:pPr>
+        <w:pStyle w:val="Normal"/>
+        <w:rPr>
+          <w:rFonts w:ascii="Calibri Light" w:hAnsi="Calibri Light" w:eastAsia="" w:cs="" w:asciiTheme="majorHAnsi" w:hAnsiTheme="majorHAnsi" w:eastAsiaTheme="majorEastAsia" w:cstheme="majorBidi"/>
           <w:b/>
-          <w:color w:themeColor="accent1" w:themeShade="bf" w:val="2F5496"/>
+          <w:color w:val="2F5496" w:themeColor="accent1" w:themeShade="bf"/>
           <w:sz w:val="44"/>
           <w:szCs w:val="32"/>
         </w:rPr>
       </w:pPr>
       <w:r>
         <w:rPr>
-          <w:rFonts w:eastAsia="" w:cs="" w:cstheme="majorBidi" w:eastAsiaTheme="majorEastAsia" w:ascii="Calibri Light" w:hAnsi="Calibri Light"/>
+          <w:rFonts w:ascii="Calibri Light" w:hAnsi="Calibri Light" w:eastAsia="" w:cs="" w:eastAsiaTheme="majorEastAsia" w:cstheme="majorBidi"/>
           <w:b/>
-          <w:color w:themeColor="accent1" w:themeShade="bf" w:val="2F5496"/>
+          <w:color w:val="2F5496" w:themeColor="accent1" w:themeShade="bf"/>
           <w:sz w:val="44"/>
           <w:szCs w:val="32"/>
         </w:rPr>
@@ -3164,33 +3354,33 @@
         <w:br w:type="page"/>
       </w:r>
     </w:p>
-    <w:p>
+    <w:p xmlns:wp14="http://schemas.microsoft.com/office/word/2010/wordml" wp14:textId="77777777">
       <w:pPr>
         <w:pStyle w:val="Heading1"/>
         <w:spacing w:before="0" w:after="0"/>
         <w:rPr/>
       </w:pPr>
-      <w:bookmarkStart w:id="23" w:name="_Toc183096225"/>
+      <w:bookmarkStart w:name="_Toc183096225" w:id="23"/>
       <w:r>
         <w:rPr/>
         <w:t>Level Elementen</w:t>
       </w:r>
       <w:bookmarkEnd w:id="23"/>
     </w:p>
-    <w:p>
+    <w:p xmlns:wp14="http://schemas.microsoft.com/office/word/2010/wordml" wp14:textId="77777777">
       <w:pPr>
         <w:pStyle w:val="Heading2"/>
         <w:rPr/>
       </w:pPr>
-      <w:bookmarkStart w:id="24" w:name="_Toc164756247"/>
+      <w:bookmarkStart w:name="_Toc164756247" w:id="24"/>
       <w:r>
         <w:rPr/>
         <w:t>Obstakels</w:t>
       </w:r>
-      <w:bookmarkStart w:id="25" w:name="_Toc164756248"/>
+      <w:bookmarkStart w:name="_Toc164756248" w:id="25"/>
       <w:bookmarkEnd w:id="24"/>
     </w:p>
-    <w:p>
+    <w:p xmlns:wp14="http://schemas.microsoft.com/office/word/2010/wordml" wp14:textId="77777777">
       <w:pPr>
         <w:pStyle w:val="Normal"/>
         <w:rPr/>
@@ -3200,7 +3390,7 @@
         <w:t>Terugkerende obstakels bestaan uit doorgangen of situaties die alleen opgelost kunnen worden door objecten te verplaatsen, te stapelen, te draaien of met kracht weg te schieten. De moeilijkheid ontstaat uit het combineren van massa, zwaartekracht, momentum en botsingen.</w:t>
       </w:r>
     </w:p>
-    <w:p>
+    <w:p xmlns:wp14="http://schemas.microsoft.com/office/word/2010/wordml" wp14:textId="77777777">
       <w:pPr>
         <w:pStyle w:val="Heading2"/>
         <w:rPr/>
@@ -3211,7 +3401,7 @@
       </w:r>
       <w:bookmarkEnd w:id="25"/>
     </w:p>
-    <w:p>
+    <w:p xmlns:wp14="http://schemas.microsoft.com/office/word/2010/wordml" wp14:textId="77777777">
       <w:pPr>
         <w:pStyle w:val="Normal"/>
         <w:rPr/>
@@ -3221,31 +3411,31 @@
         <w:t>Het hoofddoel is om een reeks physics-puzzels op te lossen en zo door de onderzoeksfaciliteit te komen. De puzzels zijn verplicht voor progressie. In het begin leert de speler één functie tegelijk; later moeten meerdere functies en natuurkundige principes gecombineerd worden.</w:t>
       </w:r>
     </w:p>
-    <w:p>
-      <w:pPr>
-        <w:pStyle w:val="Normal"/>
-        <w:rPr/>
-      </w:pPr>
-      <w:r>
-        <w:rPr/>
-      </w:r>
-    </w:p>
-    <w:p>
-      <w:pPr>
-        <w:pStyle w:val="Normal"/>
-        <w:rPr>
-          <w:rFonts w:ascii="Calibri Light" w:hAnsi="Calibri Light" w:eastAsia="" w:cs="" w:asciiTheme="majorHAnsi" w:cstheme="majorBidi" w:eastAsiaTheme="majorEastAsia" w:hAnsiTheme="majorHAnsi"/>
+    <w:p xmlns:wp14="http://schemas.microsoft.com/office/word/2010/wordml" wp14:textId="77777777">
+      <w:pPr>
+        <w:pStyle w:val="Normal"/>
+        <w:rPr/>
+      </w:pPr>
+      <w:r>
+        <w:rPr/>
+      </w:r>
+    </w:p>
+    <w:p xmlns:wp14="http://schemas.microsoft.com/office/word/2010/wordml" wp14:textId="77777777">
+      <w:pPr>
+        <w:pStyle w:val="Normal"/>
+        <w:rPr>
+          <w:rFonts w:ascii="Calibri Light" w:hAnsi="Calibri Light" w:eastAsia="" w:cs="" w:asciiTheme="majorHAnsi" w:hAnsiTheme="majorHAnsi" w:eastAsiaTheme="majorEastAsia" w:cstheme="majorBidi"/>
           <w:b/>
-          <w:color w:themeColor="accent1" w:themeShade="bf" w:val="2F5496"/>
+          <w:color w:val="2F5496" w:themeColor="accent1" w:themeShade="bf"/>
           <w:sz w:val="44"/>
           <w:szCs w:val="32"/>
         </w:rPr>
       </w:pPr>
       <w:r>
         <w:rPr>
-          <w:rFonts w:eastAsia="" w:cs="" w:cstheme="majorBidi" w:eastAsiaTheme="majorEastAsia" w:ascii="Calibri Light" w:hAnsi="Calibri Light"/>
+          <w:rFonts w:ascii="Calibri Light" w:hAnsi="Calibri Light" w:eastAsia="" w:cs="" w:eastAsiaTheme="majorEastAsia" w:cstheme="majorBidi"/>
           <w:b/>
-          <w:color w:themeColor="accent1" w:themeShade="bf" w:val="2F5496"/>
+          <w:color w:val="2F5496" w:themeColor="accent1" w:themeShade="bf"/>
           <w:sz w:val="44"/>
           <w:szCs w:val="32"/>
         </w:rPr>
@@ -3254,43 +3444,43 @@
         <w:br w:type="page"/>
       </w:r>
     </w:p>
-    <w:p>
+    <w:p xmlns:wp14="http://schemas.microsoft.com/office/word/2010/wordml" wp14:textId="77777777">
       <w:pPr>
         <w:pStyle w:val="Heading1"/>
         <w:spacing w:before="0" w:after="0"/>
         <w:rPr/>
       </w:pPr>
-      <w:bookmarkStart w:id="26" w:name="_Toc183096226"/>
+      <w:bookmarkStart w:name="_Toc183096226" w:id="26"/>
       <w:r>
         <w:rPr/>
         <w:t>Levels</w:t>
       </w:r>
       <w:bookmarkEnd w:id="26"/>
     </w:p>
-    <w:p>
+    <w:p xmlns:wp14="http://schemas.microsoft.com/office/word/2010/wordml" wp14:textId="77777777">
       <w:pPr>
         <w:pStyle w:val="Heading2"/>
         <w:rPr/>
       </w:pPr>
-      <w:bookmarkStart w:id="27" w:name="_Toc164756254"/>
+      <w:bookmarkStart w:name="_Toc164756254" w:id="27"/>
       <w:r>
         <w:rPr/>
         <w:t>Level01</w:t>
       </w:r>
       <w:bookmarkEnd w:id="27"/>
     </w:p>
-    <w:p>
+    <w:p xmlns:wp14="http://schemas.microsoft.com/office/word/2010/wordml" wp14:textId="77777777">
       <w:pPr>
         <w:pStyle w:val="Heading3"/>
         <w:rPr/>
       </w:pPr>
-      <w:bookmarkStart w:id="28" w:name="_Toc164756255"/>
+      <w:bookmarkStart w:name="_Toc164756255" w:id="28"/>
       <w:r>
         <w:rPr/>
         <w:t>Beschrijving Indeling level (layout)</w:t>
       </w:r>
     </w:p>
-    <w:p>
+    <w:p xmlns:wp14="http://schemas.microsoft.com/office/word/2010/wordml" wp14:textId="77777777">
       <w:pPr>
         <w:pStyle w:val="Normal"/>
         <w:rPr/>
@@ -3300,7 +3490,7 @@
         <w:t>Een korte introductieruimte in de onderzoeksfaciliteit. De speler krijgt eerst eenvoudige objecten en leert hoe de physics-tool objecten kan selecteren, oppakken en verplaatsen. Daarna volgt een eenvoudige doorgang die met deze functies geopend of bereikbaar wordt.</w:t>
       </w:r>
     </w:p>
-    <w:p>
+    <w:p xmlns:wp14="http://schemas.microsoft.com/office/word/2010/wordml" wp14:textId="77777777">
       <w:pPr>
         <w:pStyle w:val="Heading3"/>
         <w:rPr/>
@@ -3315,7 +3505,7 @@
         <w:t xml:space="preserve"> binnen het level</w:t>
       </w:r>
     </w:p>
-    <w:p>
+    <w:p xmlns:wp14="http://schemas.microsoft.com/office/word/2010/wordml" wp14:textId="77777777">
       <w:pPr>
         <w:pStyle w:val="Normal"/>
         <w:rPr/>
@@ -3325,19 +3515,19 @@
         <w:t>De puzzels variëren door verschillende afmetingen, posities en massa's van objecten te gebruiken.</w:t>
       </w:r>
     </w:p>
-    <w:p>
+    <w:p xmlns:wp14="http://schemas.microsoft.com/office/word/2010/wordml" wp14:textId="77777777">
       <w:pPr>
         <w:pStyle w:val="Heading3"/>
         <w:rPr/>
       </w:pPr>
-      <w:bookmarkStart w:id="29" w:name="_Toc164756256"/>
+      <w:bookmarkStart w:name="_Toc164756256" w:id="29"/>
       <w:r>
         <w:rPr/>
         <w:t>Inkadering</w:t>
       </w:r>
       <w:bookmarkEnd w:id="29"/>
     </w:p>
-    <w:p>
+    <w:p xmlns:wp14="http://schemas.microsoft.com/office/word/2010/wordml" wp14:textId="77777777">
       <w:pPr>
         <w:pStyle w:val="Normal"/>
         <w:rPr/>
@@ -3347,19 +3537,19 @@
         <w:t>Het level blijft bewust klein en overzichtelijk, zodat de basisbesturing en physics-tool centraal staan.</w:t>
       </w:r>
     </w:p>
-    <w:p>
+    <w:p xmlns:wp14="http://schemas.microsoft.com/office/word/2010/wordml" wp14:textId="77777777">
       <w:pPr>
         <w:pStyle w:val="Heading3"/>
         <w:rPr/>
       </w:pPr>
-      <w:bookmarkStart w:id="30" w:name="_Toc164756257"/>
+      <w:bookmarkStart w:name="_Toc164756257" w:id="30"/>
       <w:r>
         <w:rPr/>
         <w:t>Speciale locaties</w:t>
       </w:r>
       <w:bookmarkEnd w:id="30"/>
     </w:p>
-    <w:p>
+    <w:p xmlns:wp14="http://schemas.microsoft.com/office/word/2010/wordml" wp14:textId="77777777">
       <w:pPr>
         <w:pStyle w:val="Normal"/>
         <w:rPr/>
@@ -3369,19 +3559,19 @@
         <w:t>Een testkamer of experimenteerruimte binnen de verlaten onderzoeksfaciliteit waarin de tool veilig uitgeprobeerd kan worden.</w:t>
       </w:r>
     </w:p>
-    <w:p>
+    <w:p xmlns:wp14="http://schemas.microsoft.com/office/word/2010/wordml" wp14:textId="77777777">
       <w:pPr>
         <w:pStyle w:val="Heading3"/>
         <w:rPr/>
       </w:pPr>
-      <w:bookmarkStart w:id="31" w:name="_Toc164756258"/>
+      <w:bookmarkStart w:name="_Toc164756258" w:id="31"/>
       <w:r>
         <w:rPr/>
         <w:t>Unieke eigenschap voor level</w:t>
       </w:r>
       <w:bookmarkEnd w:id="31"/>
     </w:p>
-    <w:p>
+    <w:p xmlns:wp14="http://schemas.microsoft.com/office/word/2010/wordml" wp14:textId="77777777">
       <w:pPr>
         <w:pStyle w:val="Normal"/>
         <w:rPr/>
@@ -3391,19 +3581,19 @@
         <w:t>Dit level introduceert de basisfuncties van de physics-tool afzonderlijk.</w:t>
       </w:r>
     </w:p>
-    <w:p>
+    <w:p xmlns:wp14="http://schemas.microsoft.com/office/word/2010/wordml" wp14:textId="77777777">
       <w:pPr>
         <w:pStyle w:val="Heading3"/>
         <w:rPr/>
       </w:pPr>
-      <w:bookmarkStart w:id="32" w:name="_Toc164756259"/>
+      <w:bookmarkStart w:name="_Toc164756259" w:id="32"/>
       <w:r>
         <w:rPr/>
         <w:t>Doel(en) van het level</w:t>
       </w:r>
       <w:bookmarkEnd w:id="32"/>
     </w:p>
-    <w:p>
+    <w:p xmlns:wp14="http://schemas.microsoft.com/office/word/2010/wordml" wp14:textId="77777777">
       <w:pPr>
         <w:pStyle w:val="Normal"/>
         <w:rPr/>
@@ -3413,7 +3603,7 @@
         <w:t>De speler leert objecten selecteren, oppakken en verplaatsen en gebruikt deze functies om de uitgang te bereiken.</w:t>
       </w:r>
     </w:p>
-    <w:p>
+    <w:p xmlns:wp14="http://schemas.microsoft.com/office/word/2010/wordml" wp14:textId="77777777">
       <w:pPr>
         <w:pStyle w:val="Heading3"/>
         <w:rPr/>
@@ -3423,7 +3613,7 @@
         <w:t>Level Specifieke Achievement(s)</w:t>
       </w:r>
     </w:p>
-    <w:p>
+    <w:p xmlns:wp14="http://schemas.microsoft.com/office/word/2010/wordml" wp14:textId="77777777">
       <w:pPr>
         <w:pStyle w:val="Normal"/>
         <w:rPr/>
@@ -3433,31 +3623,31 @@
         <w:t>Niet nodig voor het proof of concept.</w:t>
       </w:r>
     </w:p>
-    <w:p>
-      <w:pPr>
-        <w:pStyle w:val="Normal"/>
-        <w:rPr/>
-      </w:pPr>
-      <w:r>
-        <w:rPr/>
-      </w:r>
-    </w:p>
-    <w:p>
-      <w:pPr>
-        <w:pStyle w:val="Normal"/>
-        <w:rPr>
-          <w:rFonts w:ascii="Calibri Light" w:hAnsi="Calibri Light" w:eastAsia="" w:cs="" w:asciiTheme="majorHAnsi" w:cstheme="majorBidi" w:eastAsiaTheme="majorEastAsia" w:hAnsiTheme="majorHAnsi"/>
+    <w:p xmlns:wp14="http://schemas.microsoft.com/office/word/2010/wordml" wp14:textId="77777777">
+      <w:pPr>
+        <w:pStyle w:val="Normal"/>
+        <w:rPr/>
+      </w:pPr>
+      <w:r>
+        <w:rPr/>
+      </w:r>
+    </w:p>
+    <w:p xmlns:wp14="http://schemas.microsoft.com/office/word/2010/wordml" wp14:textId="77777777">
+      <w:pPr>
+        <w:pStyle w:val="Normal"/>
+        <w:rPr>
+          <w:rFonts w:ascii="Calibri Light" w:hAnsi="Calibri Light" w:eastAsia="" w:cs="" w:asciiTheme="majorHAnsi" w:hAnsiTheme="majorHAnsi" w:eastAsiaTheme="majorEastAsia" w:cstheme="majorBidi"/>
           <w:b/>
-          <w:color w:themeColor="accent1" w:themeShade="bf" w:val="2F5496"/>
+          <w:color w:val="2F5496" w:themeColor="accent1" w:themeShade="bf"/>
           <w:sz w:val="44"/>
           <w:szCs w:val="32"/>
         </w:rPr>
       </w:pPr>
       <w:r>
         <w:rPr>
-          <w:rFonts w:eastAsia="" w:cs="" w:cstheme="majorBidi" w:eastAsiaTheme="majorEastAsia" w:ascii="Calibri Light" w:hAnsi="Calibri Light"/>
+          <w:rFonts w:ascii="Calibri Light" w:hAnsi="Calibri Light" w:eastAsia="" w:cs="" w:eastAsiaTheme="majorEastAsia" w:cstheme="majorBidi"/>
           <w:b/>
-          <w:color w:themeColor="accent1" w:themeShade="bf" w:val="2F5496"/>
+          <w:color w:val="2F5496" w:themeColor="accent1" w:themeShade="bf"/>
           <w:sz w:val="44"/>
           <w:szCs w:val="32"/>
         </w:rPr>
@@ -3466,7 +3656,7 @@
         <w:br w:type="page"/>
       </w:r>
     </w:p>
-    <w:p>
+    <w:p xmlns:wp14="http://schemas.microsoft.com/office/word/2010/wordml" wp14:textId="77777777">
       <w:pPr>
         <w:pStyle w:val="Heading1"/>
         <w:spacing w:before="0" w:after="0"/>
@@ -3475,7 +3665,7 @@
           <w:iCs/>
         </w:rPr>
       </w:pPr>
-      <w:bookmarkStart w:id="33" w:name="_Toc183096227"/>
+      <w:bookmarkStart w:name="_Toc183096227" w:id="33"/>
       <w:r>
         <w:rPr/>
         <w:t xml:space="preserve">Modus </w:t>
@@ -3489,19 +3679,19 @@
       </w:r>
       <w:bookmarkEnd w:id="33"/>
     </w:p>
-    <w:p>
+    <w:p xmlns:wp14="http://schemas.microsoft.com/office/word/2010/wordml" wp14:textId="77777777">
       <w:pPr>
         <w:pStyle w:val="Heading2"/>
         <w:rPr/>
       </w:pPr>
-      <w:bookmarkStart w:id="34" w:name="_Toc164756263"/>
+      <w:bookmarkStart w:name="_Toc164756263" w:id="34"/>
       <w:r>
         <w:rPr/>
         <w:t>Tutorial</w:t>
       </w:r>
       <w:bookmarkEnd w:id="34"/>
     </w:p>
-    <w:p>
+    <w:p xmlns:wp14="http://schemas.microsoft.com/office/word/2010/wordml" wp14:textId="77777777">
       <w:pPr>
         <w:pStyle w:val="Normal"/>
         <w:rPr/>
@@ -3511,19 +3701,19 @@
         <w:t>De eerste eenvoudige puzzels functioneren als tutorial en leren de physics-tool stap voor stap aan.</w:t>
       </w:r>
     </w:p>
-    <w:p>
+    <w:p xmlns:wp14="http://schemas.microsoft.com/office/word/2010/wordml" wp14:textId="77777777">
       <w:pPr>
         <w:pStyle w:val="Heading2"/>
         <w:rPr/>
       </w:pPr>
-      <w:bookmarkStart w:id="35" w:name="_Toc164756264"/>
+      <w:bookmarkStart w:name="_Toc164756264" w:id="35"/>
       <w:r>
         <w:rPr/>
         <w:t>Campagne/ Campaign</w:t>
       </w:r>
       <w:bookmarkEnd w:id="35"/>
     </w:p>
-    <w:p>
+    <w:p xmlns:wp14="http://schemas.microsoft.com/office/word/2010/wordml" wp14:textId="77777777">
       <w:pPr>
         <w:pStyle w:val="Normal"/>
         <w:rPr/>
@@ -3533,19 +3723,19 @@
         <w:t>Het proof of concept bestaat uit een korte singleplayer puzzelreeks binnen de verlaten onderzoeksfaciliteit. Een volledige campagne is nog niet nodig.</w:t>
       </w:r>
     </w:p>
-    <w:p>
+    <w:p xmlns:wp14="http://schemas.microsoft.com/office/word/2010/wordml" wp14:textId="77777777">
       <w:pPr>
         <w:pStyle w:val="Heading2"/>
         <w:rPr/>
       </w:pPr>
-      <w:bookmarkStart w:id="36" w:name="_Toc164756262"/>
+      <w:bookmarkStart w:name="_Toc164756262" w:id="36"/>
       <w:r>
         <w:rPr/>
         <w:t>Shietbaan (Shooting Range)</w:t>
       </w:r>
       <w:bookmarkEnd w:id="36"/>
     </w:p>
-    <w:p>
+    <w:p xmlns:wp14="http://schemas.microsoft.com/office/word/2010/wordml" wp14:textId="77777777">
       <w:pPr>
         <w:pStyle w:val="Normal"/>
         <w:rPr/>
@@ -3555,31 +3745,31 @@
         <w:t>Niet van toepassing; er is geen aparte schietbaan gepland. Het wegschieten van objecten wordt binnen de puzzels aangeleerd en getest.</w:t>
       </w:r>
     </w:p>
-    <w:p>
-      <w:pPr>
-        <w:pStyle w:val="Normal"/>
-        <w:rPr/>
-      </w:pPr>
-      <w:r>
-        <w:rPr/>
-      </w:r>
-    </w:p>
-    <w:p>
-      <w:pPr>
-        <w:pStyle w:val="Normal"/>
-        <w:rPr>
-          <w:rFonts w:ascii="Calibri Light" w:hAnsi="Calibri Light" w:eastAsia="" w:cs="" w:asciiTheme="majorHAnsi" w:cstheme="majorBidi" w:eastAsiaTheme="majorEastAsia" w:hAnsiTheme="majorHAnsi"/>
+    <w:p xmlns:wp14="http://schemas.microsoft.com/office/word/2010/wordml" wp14:textId="77777777">
+      <w:pPr>
+        <w:pStyle w:val="Normal"/>
+        <w:rPr/>
+      </w:pPr>
+      <w:r>
+        <w:rPr/>
+      </w:r>
+    </w:p>
+    <w:p xmlns:wp14="http://schemas.microsoft.com/office/word/2010/wordml" wp14:textId="77777777">
+      <w:pPr>
+        <w:pStyle w:val="Normal"/>
+        <w:rPr>
+          <w:rFonts w:ascii="Calibri Light" w:hAnsi="Calibri Light" w:eastAsia="" w:cs="" w:asciiTheme="majorHAnsi" w:hAnsiTheme="majorHAnsi" w:eastAsiaTheme="majorEastAsia" w:cstheme="majorBidi"/>
           <w:b/>
-          <w:color w:themeColor="accent1" w:themeShade="bf" w:val="2F5496"/>
+          <w:color w:val="2F5496" w:themeColor="accent1" w:themeShade="bf"/>
           <w:sz w:val="44"/>
           <w:szCs w:val="32"/>
         </w:rPr>
       </w:pPr>
       <w:r>
         <w:rPr>
-          <w:rFonts w:eastAsia="" w:cs="" w:cstheme="majorBidi" w:eastAsiaTheme="majorEastAsia" w:ascii="Calibri Light" w:hAnsi="Calibri Light"/>
+          <w:rFonts w:ascii="Calibri Light" w:hAnsi="Calibri Light" w:eastAsia="" w:cs="" w:eastAsiaTheme="majorEastAsia" w:cstheme="majorBidi"/>
           <w:b/>
-          <w:color w:themeColor="accent1" w:themeShade="bf" w:val="2F5496"/>
+          <w:color w:val="2F5496" w:themeColor="accent1" w:themeShade="bf"/>
           <w:sz w:val="44"/>
           <w:szCs w:val="32"/>
         </w:rPr>
@@ -3588,13 +3778,13 @@
         <w:br w:type="page"/>
       </w:r>
     </w:p>
-    <w:p>
+    <w:p xmlns:wp14="http://schemas.microsoft.com/office/word/2010/wordml" wp14:textId="77777777">
       <w:pPr>
         <w:pStyle w:val="Heading1"/>
         <w:spacing w:before="0" w:after="0"/>
         <w:rPr/>
       </w:pPr>
-      <w:bookmarkStart w:id="37" w:name="_Toc183096228"/>
+      <w:bookmarkStart w:name="_Toc183096228" w:id="37"/>
       <w:r>
         <w:rPr/>
         <w:t>Speler prestatie/ Achievement</w:t>
@@ -3608,7 +3798,7 @@
       </w:r>
       <w:bookmarkEnd w:id="37"/>
     </w:p>
-    <w:p>
+    <w:p xmlns:wp14="http://schemas.microsoft.com/office/word/2010/wordml" wp14:textId="77777777">
       <w:pPr>
         <w:pStyle w:val="Heading2"/>
         <w:rPr/>
@@ -3618,7 +3808,7 @@
         <w:t>Opslag data</w:t>
       </w:r>
     </w:p>
-    <w:p>
+    <w:p xmlns:wp14="http://schemas.microsoft.com/office/word/2010/wordml" wp14:textId="77777777">
       <w:pPr>
         <w:pStyle w:val="Normal"/>
         <w:rPr/>
@@ -3628,7 +3818,7 @@
         <w:t>Niet van toepassing voor het huidige proof of concept.</w:t>
       </w:r>
     </w:p>
-    <w:p>
+    <w:p xmlns:wp14="http://schemas.microsoft.com/office/word/2010/wordml" wp14:textId="77777777">
       <w:pPr>
         <w:pStyle w:val="Heading2"/>
         <w:rPr/>
@@ -3638,7 +3828,7 @@
         <w:t>Versleuteling</w:t>
       </w:r>
     </w:p>
-    <w:p>
+    <w:p xmlns:wp14="http://schemas.microsoft.com/office/word/2010/wordml" wp14:textId="77777777">
       <w:pPr>
         <w:pStyle w:val="Normal"/>
         <w:rPr/>
@@ -3648,7 +3838,7 @@
         <w:t>Niet van toepassing.</w:t>
       </w:r>
     </w:p>
-    <w:p>
+    <w:p xmlns:wp14="http://schemas.microsoft.com/office/word/2010/wordml" wp14:textId="77777777">
       <w:pPr>
         <w:pStyle w:val="Heading2"/>
         <w:rPr/>
@@ -3658,7 +3848,7 @@
         <w:t>Controleren van conditie</w:t>
       </w:r>
     </w:p>
-    <w:p>
+    <w:p xmlns:wp14="http://schemas.microsoft.com/office/word/2010/wordml" wp14:textId="77777777">
       <w:pPr>
         <w:pStyle w:val="Normal"/>
         <w:rPr/>
@@ -3668,7 +3858,7 @@
         <w:t>Niet van toepassing.</w:t>
       </w:r>
     </w:p>
-    <w:p>
+    <w:p xmlns:wp14="http://schemas.microsoft.com/office/word/2010/wordml" wp14:textId="77777777">
       <w:pPr>
         <w:pStyle w:val="Heading2"/>
         <w:rPr/>
@@ -3678,7 +3868,7 @@
         <w:t>Weergave van statistieken</w:t>
       </w:r>
     </w:p>
-    <w:p>
+    <w:p xmlns:wp14="http://schemas.microsoft.com/office/word/2010/wordml" wp14:textId="77777777">
       <w:pPr>
         <w:pStyle w:val="Normal"/>
         <w:rPr/>
@@ -3688,31 +3878,31 @@
         <w:t>Niet van toepassing.</w:t>
       </w:r>
     </w:p>
-    <w:p>
-      <w:pPr>
-        <w:pStyle w:val="Normal"/>
-        <w:rPr/>
-      </w:pPr>
-      <w:r>
-        <w:rPr/>
-      </w:r>
-    </w:p>
-    <w:p>
-      <w:pPr>
-        <w:pStyle w:val="Normal"/>
-        <w:rPr>
-          <w:rFonts w:ascii="Calibri Light" w:hAnsi="Calibri Light" w:eastAsia="" w:cs="" w:asciiTheme="majorHAnsi" w:cstheme="majorBidi" w:eastAsiaTheme="majorEastAsia" w:hAnsiTheme="majorHAnsi"/>
+    <w:p xmlns:wp14="http://schemas.microsoft.com/office/word/2010/wordml" wp14:textId="77777777">
+      <w:pPr>
+        <w:pStyle w:val="Normal"/>
+        <w:rPr/>
+      </w:pPr>
+      <w:r>
+        <w:rPr/>
+      </w:r>
+    </w:p>
+    <w:p xmlns:wp14="http://schemas.microsoft.com/office/word/2010/wordml" wp14:textId="77777777">
+      <w:pPr>
+        <w:pStyle w:val="Normal"/>
+        <w:rPr>
+          <w:rFonts w:ascii="Calibri Light" w:hAnsi="Calibri Light" w:eastAsia="" w:cs="" w:asciiTheme="majorHAnsi" w:hAnsiTheme="majorHAnsi" w:eastAsiaTheme="majorEastAsia" w:cstheme="majorBidi"/>
           <w:b/>
-          <w:color w:themeColor="accent1" w:themeShade="bf" w:val="2F5496"/>
+          <w:color w:val="2F5496" w:themeColor="accent1" w:themeShade="bf"/>
           <w:sz w:val="44"/>
           <w:szCs w:val="32"/>
         </w:rPr>
       </w:pPr>
       <w:r>
         <w:rPr>
-          <w:rFonts w:eastAsia="" w:cs="" w:cstheme="majorBidi" w:eastAsiaTheme="majorEastAsia" w:ascii="Calibri Light" w:hAnsi="Calibri Light"/>
+          <w:rFonts w:ascii="Calibri Light" w:hAnsi="Calibri Light" w:eastAsia="" w:cs="" w:eastAsiaTheme="majorEastAsia" w:cstheme="majorBidi"/>
           <w:b/>
-          <w:color w:themeColor="accent1" w:themeShade="bf" w:val="2F5496"/>
+          <w:color w:val="2F5496" w:themeColor="accent1" w:themeShade="bf"/>
           <w:sz w:val="44"/>
           <w:szCs w:val="32"/>
         </w:rPr>
@@ -3721,32 +3911,32 @@
         <w:br w:type="page"/>
       </w:r>
     </w:p>
-    <w:p>
+    <w:p xmlns:wp14="http://schemas.microsoft.com/office/word/2010/wordml" wp14:textId="77777777">
       <w:pPr>
         <w:pStyle w:val="Heading1"/>
         <w:spacing w:before="0" w:after="0"/>
         <w:rPr/>
       </w:pPr>
-      <w:bookmarkStart w:id="38" w:name="_Toc183096229"/>
+      <w:bookmarkStart w:name="_Toc183096229" w:id="38"/>
       <w:r>
         <w:rPr/>
         <w:t>Input/ Control scheme</w:t>
       </w:r>
       <w:bookmarkEnd w:id="38"/>
     </w:p>
-    <w:p>
+    <w:p xmlns:wp14="http://schemas.microsoft.com/office/word/2010/wordml" wp14:textId="77777777">
       <w:pPr>
         <w:pStyle w:val="Heading2"/>
         <w:rPr/>
       </w:pPr>
-      <w:bookmarkStart w:id="39" w:name="_Toc164756267"/>
+      <w:bookmarkStart w:name="_Toc164756267" w:id="39"/>
       <w:r>
         <w:rPr/>
         <w:t>Standaard Bewegen</w:t>
       </w:r>
       <w:bookmarkEnd w:id="39"/>
     </w:p>
-    <w:p>
+    <w:p xmlns:wp14="http://schemas.microsoft.com/office/word/2010/wordml" wp14:textId="77777777">
       <w:pPr>
         <w:pStyle w:val="Normal"/>
         <w:rPr/>
@@ -3756,19 +3946,19 @@
         <w:t>WASD: lopen. Spatie: springen.</w:t>
       </w:r>
     </w:p>
-    <w:p>
+    <w:p xmlns:wp14="http://schemas.microsoft.com/office/word/2010/wordml" wp14:textId="77777777">
       <w:pPr>
         <w:pStyle w:val="Heading2"/>
         <w:rPr/>
       </w:pPr>
-      <w:bookmarkStart w:id="40" w:name="_Toc164756268"/>
+      <w:bookmarkStart w:name="_Toc164756268" w:id="40"/>
       <w:r>
         <w:rPr/>
         <w:t>Rondkijken</w:t>
       </w:r>
       <w:bookmarkEnd w:id="40"/>
     </w:p>
-    <w:p>
+    <w:p xmlns:wp14="http://schemas.microsoft.com/office/word/2010/wordml" wp14:textId="77777777">
       <w:pPr>
         <w:pStyle w:val="Normal"/>
         <w:rPr/>
@@ -3778,19 +3968,19 @@
         <w:t>Muis: camera / rondkijken.</w:t>
       </w:r>
     </w:p>
-    <w:p>
+    <w:p xmlns:wp14="http://schemas.microsoft.com/office/word/2010/wordml" wp14:textId="77777777">
       <w:pPr>
         <w:pStyle w:val="Heading2"/>
         <w:rPr/>
       </w:pPr>
-      <w:bookmarkStart w:id="41" w:name="_Toc164756269"/>
+      <w:bookmarkStart w:name="_Toc164756269" w:id="41"/>
       <w:r>
         <w:rPr/>
         <w:t>Aanvallen</w:t>
       </w:r>
       <w:bookmarkEnd w:id="41"/>
     </w:p>
-    <w:p>
+    <w:p xmlns:wp14="http://schemas.microsoft.com/office/word/2010/wordml" wp14:textId="77777777">
       <w:pPr>
         <w:pStyle w:val="Normal"/>
         <w:rPr/>
@@ -3800,19 +3990,19 @@
         <w:t>Linkermuisknop: een vastgehouden object met kracht wegschieten.</w:t>
       </w:r>
     </w:p>
-    <w:p>
+    <w:p xmlns:wp14="http://schemas.microsoft.com/office/word/2010/wordml" wp14:textId="77777777">
       <w:pPr>
         <w:pStyle w:val="Heading2"/>
         <w:rPr/>
       </w:pPr>
-      <w:bookmarkStart w:id="42" w:name="_Toc164756270"/>
+      <w:bookmarkStart w:name="_Toc164756270" w:id="42"/>
       <w:r>
         <w:rPr/>
         <w:t>Wapen-modi wisselen</w:t>
       </w:r>
       <w:bookmarkEnd w:id="42"/>
     </w:p>
-    <w:p>
+    <w:p xmlns:wp14="http://schemas.microsoft.com/office/word/2010/wordml" wp14:textId="77777777">
       <w:pPr>
         <w:pStyle w:val="Normal"/>
         <w:rPr/>
@@ -3822,19 +4012,19 @@
         <w:t>Niet van toepassing; de speler heeft één centrale physics-tool.</w:t>
       </w:r>
     </w:p>
-    <w:p>
+    <w:p xmlns:wp14="http://schemas.microsoft.com/office/word/2010/wordml" wp14:textId="77777777">
       <w:pPr>
         <w:pStyle w:val="Heading2"/>
         <w:rPr/>
       </w:pPr>
-      <w:bookmarkStart w:id="43" w:name="_Toc164756271"/>
+      <w:bookmarkStart w:name="_Toc164756271" w:id="43"/>
       <w:r>
         <w:rPr/>
         <w:t>Speciale Bewegingen</w:t>
       </w:r>
       <w:bookmarkEnd w:id="43"/>
     </w:p>
-    <w:p>
+    <w:p xmlns:wp14="http://schemas.microsoft.com/office/word/2010/wordml" wp14:textId="77777777">
       <w:pPr>
         <w:pStyle w:val="Normal"/>
         <w:rPr/>
@@ -3852,19 +4042,19 @@
         <w:t>.</w:t>
       </w:r>
     </w:p>
-    <w:p>
+    <w:p xmlns:wp14="http://schemas.microsoft.com/office/word/2010/wordml" wp14:textId="77777777">
       <w:pPr>
         <w:pStyle w:val="Heading2"/>
         <w:rPr/>
       </w:pPr>
-      <w:bookmarkStart w:id="44" w:name="_Toc164756272"/>
+      <w:bookmarkStart w:name="_Toc164756272" w:id="44"/>
       <w:r>
         <w:rPr/>
         <w:t>Projectielen/objecten gooien</w:t>
       </w:r>
       <w:bookmarkEnd w:id="44"/>
     </w:p>
-    <w:p>
+    <w:p xmlns:wp14="http://schemas.microsoft.com/office/word/2010/wordml" wp14:textId="77777777">
       <w:pPr>
         <w:pStyle w:val="Normal"/>
         <w:rPr/>
@@ -3874,19 +4064,19 @@
         <w:t>Objecten worden niet met de hand gegooid; de physics-tool gebruikt kracht om een vastgehouden object weg te schieten.</w:t>
       </w:r>
     </w:p>
-    <w:p>
+    <w:p xmlns:wp14="http://schemas.microsoft.com/office/word/2010/wordml" wp14:textId="77777777">
       <w:pPr>
         <w:pStyle w:val="Heading2"/>
         <w:rPr/>
       </w:pPr>
-      <w:bookmarkStart w:id="45" w:name="_Toc164756273"/>
+      <w:bookmarkStart w:name="_Toc164756273" w:id="45"/>
       <w:r>
         <w:rPr/>
         <w:t>Snel wapens wisselen</w:t>
       </w:r>
       <w:bookmarkEnd w:id="45"/>
     </w:p>
-    <w:p>
+    <w:p xmlns:wp14="http://schemas.microsoft.com/office/word/2010/wordml" wp14:textId="77777777">
       <w:pPr>
         <w:pStyle w:val="Normal"/>
         <w:rPr/>
@@ -3896,31 +4086,31 @@
         <w:t>Niet van toepassing; er zijn geen verschillende wapens in het proof of concept.</w:t>
       </w:r>
     </w:p>
-    <w:p>
-      <w:pPr>
-        <w:pStyle w:val="Normal"/>
-        <w:rPr/>
-      </w:pPr>
-      <w:r>
-        <w:rPr/>
-      </w:r>
-    </w:p>
-    <w:p>
-      <w:pPr>
-        <w:pStyle w:val="Normal"/>
-        <w:rPr>
-          <w:rFonts w:ascii="Calibri Light" w:hAnsi="Calibri Light" w:eastAsia="" w:cs="" w:asciiTheme="majorHAnsi" w:cstheme="majorBidi" w:eastAsiaTheme="majorEastAsia" w:hAnsiTheme="majorHAnsi"/>
+    <w:p xmlns:wp14="http://schemas.microsoft.com/office/word/2010/wordml" wp14:textId="77777777">
+      <w:pPr>
+        <w:pStyle w:val="Normal"/>
+        <w:rPr/>
+      </w:pPr>
+      <w:r>
+        <w:rPr/>
+      </w:r>
+    </w:p>
+    <w:p xmlns:wp14="http://schemas.microsoft.com/office/word/2010/wordml" wp14:textId="77777777">
+      <w:pPr>
+        <w:pStyle w:val="Normal"/>
+        <w:rPr>
+          <w:rFonts w:ascii="Calibri Light" w:hAnsi="Calibri Light" w:eastAsia="" w:cs="" w:asciiTheme="majorHAnsi" w:hAnsiTheme="majorHAnsi" w:eastAsiaTheme="majorEastAsia" w:cstheme="majorBidi"/>
           <w:b/>
-          <w:color w:themeColor="accent1" w:themeShade="bf" w:val="2F5496"/>
+          <w:color w:val="2F5496" w:themeColor="accent1" w:themeShade="bf"/>
           <w:sz w:val="44"/>
           <w:szCs w:val="32"/>
         </w:rPr>
       </w:pPr>
       <w:r>
         <w:rPr>
-          <w:rFonts w:eastAsia="" w:cs="" w:cstheme="majorBidi" w:eastAsiaTheme="majorEastAsia" w:ascii="Calibri Light" w:hAnsi="Calibri Light"/>
+          <w:rFonts w:ascii="Calibri Light" w:hAnsi="Calibri Light" w:eastAsia="" w:cs="" w:eastAsiaTheme="majorEastAsia" w:cstheme="majorBidi"/>
           <w:b/>
-          <w:color w:themeColor="accent1" w:themeShade="bf" w:val="2F5496"/>
+          <w:color w:val="2F5496" w:themeColor="accent1" w:themeShade="bf"/>
           <w:sz w:val="44"/>
           <w:szCs w:val="32"/>
         </w:rPr>
@@ -3929,106 +4119,97 @@
         <w:br w:type="page"/>
       </w:r>
     </w:p>
-    <w:p>
+    <w:p xmlns:wp14="http://schemas.microsoft.com/office/word/2010/wordml" wp14:textId="77777777">
       <w:pPr>
         <w:pStyle w:val="Heading1"/>
         <w:spacing w:before="0" w:after="0"/>
         <w:rPr/>
       </w:pPr>
-      <w:bookmarkStart w:id="46" w:name="_Toc183096230"/>
+      <w:bookmarkStart w:name="_Toc183096230" w:id="46"/>
       <w:r>
         <w:rPr/>
         <w:t>Story/ Scenario/ Synopsis/ Lore</w:t>
       </w:r>
       <w:bookmarkEnd w:id="46"/>
     </w:p>
+    <w:p xmlns:wp14="http://schemas.microsoft.com/office/word/2010/wordml" wp14:textId="77777777">
+      <w:pPr>
+        <w:pStyle w:val="Heading2"/>
+        <w:rPr/>
+      </w:pPr>
+      <w:bookmarkStart w:name="_Toc164756275" w:id="47"/>
+      <w:r>
+        <w:rPr/>
+        <w:t>Achtergrond Speel Wereld</w:t>
+      </w:r>
+      <w:bookmarkEnd w:id="47"/>
+    </w:p>
+    <w:p xmlns:wp14="http://schemas.microsoft.com/office/word/2010/wordml" wp14:textId="77777777">
+      <w:pPr>
+        <w:pStyle w:val="Normal"/>
+        <w:rPr/>
+      </w:pPr>
+      <w:r>
+        <w:rPr/>
+        <w:t>Het spel speelt zich af in een verlaten, industriële onderzoeksfaciliteit. De omgeving bestaat uit testkamers en technische ruimtes waarin natuurkundige experimenten en objectmanipulatie centraal staan. De exacte reden waarom de faciliteit verlaten is, hoeft voor het proof of concept nog niet volledig uitgewerkt te worden.</w:t>
+      </w:r>
+    </w:p>
+    <w:p xmlns:wp14="http://schemas.microsoft.com/office/word/2010/wordml" wp14:textId="77777777">
+      <w:pPr>
+        <w:pStyle w:val="Heading2"/>
+        <w:rPr/>
+      </w:pPr>
+      <w:bookmarkStart w:name="_Toc164756276" w:id="48"/>
+      <w:r>
+        <w:rPr/>
+        <w:t>Verloop speelwereld (veranderingen gedurende het spel)</w:t>
+      </w:r>
+      <w:bookmarkEnd w:id="48"/>
+    </w:p>
+    <w:p xmlns:wp14="http://schemas.microsoft.com/office/word/2010/wordml" wp14:textId="77777777">
+      <w:pPr>
+        <w:pStyle w:val="Normal"/>
+        <w:rPr/>
+      </w:pPr>
+      <w:r>
+        <w:rPr/>
+        <w:t>De speler beweegt steeds verder door de faciliteit. Naarmate het spel vordert worden de testkamers complexer en worden eerder aangeleerde functies van de physics-tool gecombineerd met massa, momentum, zwaartekracht en botsingen.</w:t>
+      </w:r>
+    </w:p>
+    <w:p xmlns:wp14="http://schemas.microsoft.com/office/word/2010/wordml" wp14:textId="77777777">
+      <w:pPr>
+        <w:pStyle w:val="Heading2"/>
+        <w:rPr/>
+      </w:pPr>
+      <w:bookmarkStart w:name="_Toc164756277" w:id="49"/>
+      <w:r>
+        <w:rPr/>
+        <w:t>Achtergrond (Hoofd)karakter(s)</w:t>
+      </w:r>
+      <w:bookmarkEnd w:id="49"/>
+    </w:p>
+    <w:p xmlns:wp14="http://schemas.microsoft.com/office/word/2010/wordml" wp14:textId="77777777">
+      <w:pPr>
+        <w:pStyle w:val="Normal"/>
+        <w:rPr/>
+      </w:pPr>
+      <w:r>
+        <w:rPr/>
+        <w:t>De hoofdpersoon wordt in het proof of concept niet uitgebreid uitgewerkt. De speler wordt vooral gezien als degene die de faciliteit verkent en de physics-tool gebruikt om de testkamers te doorlopen.</w:t>
+      </w:r>
+    </w:p>
+    <w:p xmlns:wp14="http://schemas.microsoft.com/office/word/2010/wordml" wp14:textId="77777777">
+      <w:pPr>
+        <w:pStyle w:val="Normal"/>
+        <w:rPr/>
+      </w:pPr>
+    </w:p>
     <w:p>
       <w:pPr>
-        <w:pStyle w:val="Heading2"/>
-        <w:rPr/>
-      </w:pPr>
-      <w:bookmarkStart w:id="47" w:name="_Toc164756275"/>
-      <w:r>
-        <w:rPr/>
-        <w:t>Achtergrond Speel Wereld</w:t>
-      </w:r>
-      <w:bookmarkEnd w:id="47"/>
-    </w:p>
-    <w:p>
-      <w:pPr>
-        <w:pStyle w:val="Normal"/>
-        <w:rPr/>
-      </w:pPr>
-      <w:r>
-        <w:rPr/>
-        <w:t>Het spel speelt zich af in een verlaten, industriële onderzoeksfaciliteit. De omgeving bestaat uit testkamers en technische ruimtes waarin natuurkundige experimenten en objectmanipulatie centraal staan. De exacte reden waarom de faciliteit verlaten is, hoeft voor het proof of concept nog niet volledig uitgewerkt te worden.</w:t>
-      </w:r>
-    </w:p>
-    <w:p>
-      <w:pPr>
-        <w:pStyle w:val="Heading2"/>
-        <w:rPr/>
-      </w:pPr>
-      <w:bookmarkStart w:id="48" w:name="_Toc164756276"/>
-      <w:r>
-        <w:rPr/>
-        <w:t>Verloop speelwereld (veranderingen gedurende het spel)</w:t>
-      </w:r>
-      <w:bookmarkEnd w:id="48"/>
-    </w:p>
-    <w:p>
-      <w:pPr>
-        <w:pStyle w:val="Normal"/>
-        <w:rPr/>
-      </w:pPr>
-      <w:r>
-        <w:rPr/>
-        <w:t>De speler beweegt steeds verder door de faciliteit. Naarmate het spel vordert worden de testkamers complexer en worden eerder aangeleerde functies van de physics-tool gecombineerd met massa, momentum, zwaartekracht en botsingen.</w:t>
-      </w:r>
-    </w:p>
-    <w:p>
-      <w:pPr>
-        <w:pStyle w:val="Heading2"/>
-        <w:rPr/>
-      </w:pPr>
-      <w:bookmarkStart w:id="49" w:name="_Toc164756277"/>
-      <w:r>
-        <w:rPr/>
-        <w:t>Achtergrond (Hoofd)karakter(s)</w:t>
-      </w:r>
-      <w:bookmarkEnd w:id="49"/>
-    </w:p>
-    <w:p>
-      <w:pPr>
-        <w:pStyle w:val="Normal"/>
-        <w:rPr/>
-      </w:pPr>
-      <w:r>
-        <w:rPr/>
-        <w:t>De hoofdpersoon wordt in het proof of concept niet uitgebreid uitgewerkt. De speler wordt vooral gezien als degene die de faciliteit verkent en de physics-tool gebruikt om de testkamers te doorlopen.</w:t>
-      </w:r>
-    </w:p>
-    <w:p>
-      <w:pPr>
-        <w:pStyle w:val="Normal"/>
-        <w:rPr/>
-      </w:pPr>
-      <w:r>
-        <w:rPr/>
-      </w:r>
-    </w:p>
-    <w:p>
-      <w:pPr>
-        <w:pStyle w:val="Normal"/>
-        <w:widowControl/>
+        <w:pStyle w:val="Normal"/>
+        <w:widowControl w:val="1"/>
         <w:bidi w:val="0"/>
-        <w:spacing w:lineRule="auto" w:line="259" w:before="0" w:after="160"/>
-        <w:jc w:val="start"/>
-        <w:rPr/>
-      </w:pPr>
-      <w:r>
-        <w:rPr/>
-      </w:r>
+      </w:pPr>
     </w:p>
     <w:sectPr>
       <w:headerReference w:type="even" r:id="rId3"/>
@@ -4038,13 +4219,14 @@
       <w:footerReference w:type="default" r:id="rId7"/>
       <w:footerReference w:type="first" r:id="rId8"/>
       <w:type w:val="nextPage"/>
-      <w:pgSz w:w="11906" w:h="16838"/>
-      <w:pgMar w:left="1417" w:right="1417" w:gutter="0" w:header="708" w:top="1417" w:footer="708" w:bottom="1417"/>
+      <w:pgSz w:w="11906" w:h="16838" w:orient="portrait"/>
+      <w:pgMar w:top="1417" w:right="1417" w:bottom="1417" w:left="1417" w:header="708" w:footer="708" w:gutter="0"/>
       <w:pgNumType w:fmt="decimal"/>
       <w:formProt w:val="false"/>
       <w:titlePg/>
       <w:textDirection w:val="lrTb"/>
       <w:docGrid w:type="default" w:linePitch="360" w:charSpace="0"/>
+      <w:cols w:num="1"/>
     </w:sectPr>
   </w:body>
 </w:document>
@@ -4052,7 +4234,7 @@
 
 <file path=word/footer1.xml><?xml version="1.0" encoding="utf-8"?>
 <w:ftr xmlns:o="urn:schemas-microsoft-com:office:office" xmlns:r="http://schemas.openxmlformats.org/officeDocument/2006/relationships" xmlns:v="urn:schemas-microsoft-com:vml" xmlns:w="http://schemas.openxmlformats.org/wordprocessingml/2006/main" xmlns:w10="urn:schemas-microsoft-com:office:word" xmlns:wp="http://schemas.openxmlformats.org/drawingml/2006/wordprocessingDrawing" xmlns:pic="http://schemas.openxmlformats.org/drawingml/2006/picture" xmlns:wps="http://schemas.microsoft.com/office/word/2010/wordprocessingShape" xmlns:wpg="http://schemas.microsoft.com/office/word/2010/wordprocessingGroup" xmlns:mc="http://schemas.openxmlformats.org/markup-compatibility/2006" xmlns:wp14="http://schemas.microsoft.com/office/word/2010/wordprocessingDrawing" xmlns:w14="http://schemas.microsoft.com/office/word/2010/wordml" xmlns:w15="http://schemas.microsoft.com/office/word/2012/wordml" mc:Ignorable="w14 wp14 w15">
-  <w:p>
+  <w:p xmlns:wp14="http://schemas.microsoft.com/office/word/2010/wordml" wp14:textId="77777777">
     <w:pPr>
       <w:pStyle w:val="Footer"/>
       <w:rPr/>
@@ -4065,17 +4247,17 @@
 </file>
 
 <file path=word/footer2.xml><?xml version="1.0" encoding="utf-8"?>
-<w:ftr xmlns:o="urn:schemas-microsoft-com:office:office" xmlns:r="http://schemas.openxmlformats.org/officeDocument/2006/relationships" xmlns:v="urn:schemas-microsoft-com:vml" xmlns:w="http://schemas.openxmlformats.org/wordprocessingml/2006/main" xmlns:w10="urn:schemas-microsoft-com:office:word" xmlns:wp="http://schemas.openxmlformats.org/drawingml/2006/wordprocessingDrawing" xmlns:pic="http://schemas.openxmlformats.org/drawingml/2006/picture" xmlns:wps="http://schemas.microsoft.com/office/word/2010/wordprocessingShape" xmlns:wpg="http://schemas.microsoft.com/office/word/2010/wordprocessingGroup" xmlns:mc="http://schemas.openxmlformats.org/markup-compatibility/2006" xmlns:wp14="http://schemas.microsoft.com/office/word/2010/wordprocessingDrawing" xmlns:w14="http://schemas.microsoft.com/office/word/2010/wordml" xmlns:w15="http://schemas.microsoft.com/office/word/2012/wordml" mc:Ignorable="w14 wp14 w15">
-  <w:p>
+<w:ftr xmlns:o="urn:schemas-microsoft-com:office:office" xmlns:r="http://schemas.openxmlformats.org/officeDocument/2006/relationships" xmlns:v="urn:schemas-microsoft-com:vml" xmlns:w="http://schemas.openxmlformats.org/wordprocessingml/2006/main" xmlns:w10="urn:schemas-microsoft-com:office:word" xmlns:wp="http://schemas.openxmlformats.org/drawingml/2006/wordprocessingDrawing" xmlns:pic="http://schemas.openxmlformats.org/drawingml/2006/picture" xmlns:wps="http://schemas.microsoft.com/office/word/2010/wordprocessingShape" xmlns:wpg="http://schemas.microsoft.com/office/word/2010/wordprocessingGroup" xmlns:mc="http://schemas.openxmlformats.org/markup-compatibility/2006" xmlns:wp14="http://schemas.microsoft.com/office/word/2010/wordprocessingDrawing" xmlns:w14="http://schemas.microsoft.com/office/word/2010/wordml" xmlns:w15="http://schemas.microsoft.com/office/word/2012/wordml" xmlns:a="http://schemas.openxmlformats.org/drawingml/2006/main" mc:Ignorable="w14 wp14 w15">
+  <w:p xmlns:wp14="http://schemas.microsoft.com/office/word/2010/wordml" wp14:textId="77777777">
     <w:pPr>
       <w:pStyle w:val="Normal"/>
       <w:pBdr/>
       <w:tabs>
         <w:tab w:val="clear" w:pos="708"/>
-        <w:tab w:val="center" w:pos="567" w:leader="none"/>
-        <w:tab w:val="left" w:pos="3119" w:leader="none"/>
-        <w:tab w:val="center" w:pos="4536" w:leader="none"/>
-        <w:tab w:val="right" w:pos="9072" w:leader="none"/>
+        <w:tab w:val="center" w:leader="none" w:pos="567"/>
+        <w:tab w:val="left" w:leader="none" w:pos="3119"/>
+        <w:tab w:val="center" w:leader="none" w:pos="4536"/>
+        <w:tab w:val="right" w:leader="none" w:pos="9072"/>
       </w:tabs>
       <w:spacing w:before="0" w:after="160"/>
       <w:jc w:val="center"/>
@@ -4085,7 +4267,7 @@
     </w:pPr>
     <w:r>
       <w:drawing>
-        <wp:anchor distT="0" distB="0" distL="114300" distR="114300" simplePos="0" relativeHeight="18" behindDoc="0" locked="0" layoutInCell="0" allowOverlap="1">
+        <wp:anchor xmlns:wp14="http://schemas.microsoft.com/office/word/2010/wordprocessingDrawing" distT="0" distB="0" distL="114300" distR="114300" simplePos="0" relativeHeight="18" behindDoc="0" locked="0" layoutInCell="0" allowOverlap="1" wp14:anchorId="403EEEF9" wp14:editId="7777777">
           <wp:simplePos x="0" y="0"/>
           <wp:positionH relativeFrom="column">
             <wp:posOffset>-15240</wp:posOffset>
@@ -4147,7 +4329,23 @@
         <w:lang w:val="en-US"/>
       </w:rPr>
       <w:tab/>
+    </w:r>
+    <w:r>
+      <w:rPr>
+        <w:color w:val="000000"/>
+        <w:sz w:val="16"/>
+        <w:szCs w:val="16"/>
+        <w:lang w:val="en-US"/>
+      </w:rPr>
       <w:t>Sjabloon 2: Game Design Document EPOC - B1-K1-W1</w:t>
+    </w:r>
+    <w:r>
+      <w:rPr>
+        <w:color w:val="000000"/>
+        <w:sz w:val="16"/>
+        <w:szCs w:val="16"/>
+        <w:lang w:val="en-US"/>
+      </w:rPr>
       <w:tab/>
     </w:r>
     <w:r>
@@ -4255,7 +4453,7 @@
 
 <file path=word/footer3.xml><?xml version="1.0" encoding="utf-8"?>
 <w:ftr xmlns:o="urn:schemas-microsoft-com:office:office" xmlns:r="http://schemas.openxmlformats.org/officeDocument/2006/relationships" xmlns:v="urn:schemas-microsoft-com:vml" xmlns:w="http://schemas.openxmlformats.org/wordprocessingml/2006/main" xmlns:w10="urn:schemas-microsoft-com:office:word" xmlns:wp="http://schemas.openxmlformats.org/drawingml/2006/wordprocessingDrawing" xmlns:pic="http://schemas.openxmlformats.org/drawingml/2006/picture" xmlns:wps="http://schemas.microsoft.com/office/word/2010/wordprocessingShape" xmlns:wpg="http://schemas.microsoft.com/office/word/2010/wordprocessingGroup" xmlns:mc="http://schemas.openxmlformats.org/markup-compatibility/2006" xmlns:wp14="http://schemas.microsoft.com/office/word/2010/wordprocessingDrawing" xmlns:w14="http://schemas.microsoft.com/office/word/2010/wordml" xmlns:w15="http://schemas.microsoft.com/office/word/2012/wordml" mc:Ignorable="w14 wp14 w15">
-  <w:p>
+  <w:p xmlns:wp14="http://schemas.microsoft.com/office/word/2010/wordml" wp14:textId="77777777">
     <w:pPr>
       <w:pStyle w:val="Footer"/>
       <w:rPr/>
@@ -4269,7 +4467,7 @@
 
 <file path=word/header1.xml><?xml version="1.0" encoding="utf-8"?>
 <w:hdr xmlns:o="urn:schemas-microsoft-com:office:office" xmlns:r="http://schemas.openxmlformats.org/officeDocument/2006/relationships" xmlns:v="urn:schemas-microsoft-com:vml" xmlns:w="http://schemas.openxmlformats.org/wordprocessingml/2006/main" xmlns:w10="urn:schemas-microsoft-com:office:word" xmlns:wp="http://schemas.openxmlformats.org/drawingml/2006/wordprocessingDrawing" xmlns:pic="http://schemas.openxmlformats.org/drawingml/2006/picture" xmlns:wps="http://schemas.microsoft.com/office/word/2010/wordprocessingShape" xmlns:wpg="http://schemas.microsoft.com/office/word/2010/wordprocessingGroup" xmlns:mc="http://schemas.openxmlformats.org/markup-compatibility/2006" xmlns:wp14="http://schemas.microsoft.com/office/word/2010/wordprocessingDrawing" xmlns:w14="http://schemas.microsoft.com/office/word/2010/wordml" xmlns:w15="http://schemas.microsoft.com/office/word/2012/wordml" mc:Ignorable="w14 wp14 w15">
-  <w:p>
+  <w:p xmlns:wp14="http://schemas.microsoft.com/office/word/2010/wordml" wp14:textId="77777777">
     <w:pPr>
       <w:pStyle w:val="Header"/>
       <w:rPr/>
@@ -4283,7 +4481,7 @@
 
 <file path=word/header2.xml><?xml version="1.0" encoding="utf-8"?>
 <w:hdr xmlns:o="urn:schemas-microsoft-com:office:office" xmlns:r="http://schemas.openxmlformats.org/officeDocument/2006/relationships" xmlns:v="urn:schemas-microsoft-com:vml" xmlns:w="http://schemas.openxmlformats.org/wordprocessingml/2006/main" xmlns:w10="urn:schemas-microsoft-com:office:word" xmlns:wp="http://schemas.openxmlformats.org/drawingml/2006/wordprocessingDrawing" xmlns:pic="http://schemas.openxmlformats.org/drawingml/2006/picture" xmlns:wps="http://schemas.microsoft.com/office/word/2010/wordprocessingShape" xmlns:wpg="http://schemas.microsoft.com/office/word/2010/wordprocessingGroup" xmlns:mc="http://schemas.openxmlformats.org/markup-compatibility/2006" xmlns:wp14="http://schemas.microsoft.com/office/word/2010/wordprocessingDrawing" xmlns:w14="http://schemas.microsoft.com/office/word/2010/wordml" xmlns:w15="http://schemas.microsoft.com/office/word/2012/wordml" mc:Ignorable="w14 wp14 w15">
-  <w:p>
+  <w:p xmlns:wp14="http://schemas.microsoft.com/office/word/2010/wordml" wp14:textId="77777777">
     <w:pPr>
       <w:pStyle w:val="Header"/>
       <w:jc w:val="center"/>
@@ -4297,8 +4495,8 @@
 </file>
 
 <file path=word/header3.xml><?xml version="1.0" encoding="utf-8"?>
-<w:hdr xmlns:o="urn:schemas-microsoft-com:office:office" xmlns:r="http://schemas.openxmlformats.org/officeDocument/2006/relationships" xmlns:v="urn:schemas-microsoft-com:vml" xmlns:w="http://schemas.openxmlformats.org/wordprocessingml/2006/main" xmlns:w10="urn:schemas-microsoft-com:office:word" xmlns:wp="http://schemas.openxmlformats.org/drawingml/2006/wordprocessingDrawing" xmlns:pic="http://schemas.openxmlformats.org/drawingml/2006/picture" xmlns:wps="http://schemas.microsoft.com/office/word/2010/wordprocessingShape" xmlns:wpg="http://schemas.microsoft.com/office/word/2010/wordprocessingGroup" xmlns:mc="http://schemas.openxmlformats.org/markup-compatibility/2006" xmlns:wp14="http://schemas.microsoft.com/office/word/2010/wordprocessingDrawing" xmlns:w14="http://schemas.microsoft.com/office/word/2010/wordml" xmlns:w15="http://schemas.microsoft.com/office/word/2012/wordml" mc:Ignorable="w14 wp14 w15">
-  <w:p>
+<w:hdr xmlns:o="urn:schemas-microsoft-com:office:office" xmlns:r="http://schemas.openxmlformats.org/officeDocument/2006/relationships" xmlns:v="urn:schemas-microsoft-com:vml" xmlns:w="http://schemas.openxmlformats.org/wordprocessingml/2006/main" xmlns:w10="urn:schemas-microsoft-com:office:word" xmlns:wp="http://schemas.openxmlformats.org/drawingml/2006/wordprocessingDrawing" xmlns:pic="http://schemas.openxmlformats.org/drawingml/2006/picture" xmlns:wps="http://schemas.microsoft.com/office/word/2010/wordprocessingShape" xmlns:wpg="http://schemas.microsoft.com/office/word/2010/wordprocessingGroup" xmlns:mc="http://schemas.openxmlformats.org/markup-compatibility/2006" xmlns:wp14="http://schemas.microsoft.com/office/word/2010/wordprocessingDrawing" xmlns:w14="http://schemas.microsoft.com/office/word/2010/wordml" xmlns:w15="http://schemas.microsoft.com/office/word/2012/wordml" xmlns:a="http://schemas.openxmlformats.org/drawingml/2006/main" mc:Ignorable="w14 wp14 w15">
+  <w:p xmlns:wp14="http://schemas.microsoft.com/office/word/2010/wordml" wp14:textId="77777777">
     <w:pPr>
       <w:pStyle w:val="Header"/>
       <w:jc w:val="center"/>
@@ -4307,7 +4505,7 @@
     <w:r>
       <w:rPr/>
       <w:drawing>
-        <wp:inline distT="0" distB="0" distL="0" distR="0">
+        <wp:inline xmlns:wp14="http://schemas.microsoft.com/office/word/2010/wordprocessingDrawing" distT="0" distB="0" distL="0" distR="0" wp14:anchorId="68628F0F" wp14:editId="7777777">
           <wp:extent cx="1257935" cy="494030"/>
           <wp:effectExtent l="0" t="0" r="0" b="0"/>
           <wp:docPr id="3" name="Image3" descr="Afbeelding met tekst, Lettertype, Graphics, grafische vormgeving&#10;&#10;Automatisch gegenereerde beschrijving"/>
@@ -4350,11 +4548,11 @@
 </file>
 
 <file path=word/styles.xml><?xml version="1.0" encoding="utf-8"?>
-<w:styles xmlns:w="http://schemas.openxmlformats.org/wordprocessingml/2006/main" xmlns:w14="http://schemas.microsoft.com/office/word/2010/wordml" xmlns:mc="http://schemas.openxmlformats.org/markup-compatibility/2006" mc:Ignorable="w14">
+<w:styles xmlns:wp14="http://schemas.microsoft.com/office/word/2010/wordprocessingDrawing" xmlns:w="http://schemas.openxmlformats.org/wordprocessingml/2006/main" xmlns:w14="http://schemas.microsoft.com/office/word/2010/wordml" xmlns:mc="http://schemas.openxmlformats.org/markup-compatibility/2006" mc:Ignorable="w14 wp14">
   <w:docDefaults>
     <w:rPrDefault>
       <w:rPr>
-        <w:rFonts w:ascii="Calibri" w:hAnsi="Calibri" w:eastAsia="Calibri" w:cs="" w:asciiTheme="minorHAnsi" w:cstheme="minorBidi" w:eastAsiaTheme="minorHAnsi" w:hAnsiTheme="minorHAnsi"/>
+        <w:rFonts w:ascii="Calibri" w:hAnsi="Calibri" w:eastAsia="Calibri" w:cs="" w:asciiTheme="minorHAnsi" w:hAnsiTheme="minorHAnsi" w:eastAsiaTheme="minorHAnsi" w:cstheme="minorBidi"/>
         <w:kern w:val="2"/>
         <w:sz w:val="22"/>
         <w:szCs w:val="22"/>
@@ -4752,11 +4950,11 @@
     <w:pPr>
       <w:widowControl/>
       <w:bidi w:val="0"/>
-      <w:spacing w:lineRule="auto" w:line="259" w:before="0" w:after="160"/>
+      <w:spacing w:before="0" w:after="160" w:line="259" w:lineRule="auto"/>
       <w:jc w:val="start"/>
     </w:pPr>
     <w:rPr>
-      <w:rFonts w:ascii="Calibri" w:hAnsi="Calibri" w:eastAsia="Calibri" w:cs="" w:asciiTheme="minorHAnsi" w:cstheme="minorBidi" w:eastAsiaTheme="minorHAnsi" w:hAnsiTheme="minorHAnsi"/>
+      <w:rFonts w:ascii="Calibri" w:hAnsi="Calibri" w:eastAsia="Calibri" w:cs="" w:asciiTheme="minorHAnsi" w:hAnsiTheme="minorHAnsi" w:eastAsiaTheme="minorHAnsi" w:cstheme="minorBidi"/>
       <w:color w:val="auto"/>
       <w:kern w:val="2"/>
       <w:sz w:val="22"/>
@@ -4780,9 +4978,9 @@
       <w:outlineLvl w:val="0"/>
     </w:pPr>
     <w:rPr>
-      <w:rFonts w:ascii="Calibri Light" w:hAnsi="Calibri Light" w:eastAsia="" w:cs="" w:asciiTheme="majorHAnsi" w:cstheme="majorBidi" w:eastAsiaTheme="majorEastAsia" w:hAnsiTheme="majorHAnsi"/>
+      <w:rFonts w:ascii="Calibri Light" w:hAnsi="Calibri Light" w:eastAsia="" w:cs="" w:asciiTheme="majorHAnsi" w:hAnsiTheme="majorHAnsi" w:eastAsiaTheme="majorEastAsia" w:cstheme="majorBidi"/>
       <w:b/>
-      <w:color w:themeColor="accent1" w:themeShade="bf" w:val="2F5496"/>
+      <w:color w:val="2F5496" w:themeColor="accent1" w:themeShade="bf"/>
       <w:sz w:val="44"/>
       <w:szCs w:val="32"/>
     </w:rPr>
@@ -4803,8 +5001,8 @@
       <w:outlineLvl w:val="1"/>
     </w:pPr>
     <w:rPr>
-      <w:rFonts w:ascii="Calibri Light" w:hAnsi="Calibri Light" w:eastAsia="" w:cs="" w:asciiTheme="majorHAnsi" w:cstheme="majorBidi" w:eastAsiaTheme="majorEastAsia" w:hAnsiTheme="majorHAnsi"/>
-      <w:color w:themeColor="accent1" w:themeShade="bf" w:val="2F5496"/>
+      <w:rFonts w:ascii="Calibri Light" w:hAnsi="Calibri Light" w:eastAsia="" w:cs="" w:asciiTheme="majorHAnsi" w:hAnsiTheme="majorHAnsi" w:eastAsiaTheme="majorEastAsia" w:cstheme="majorBidi"/>
+      <w:color w:val="2F5496" w:themeColor="accent1" w:themeShade="bf"/>
       <w:sz w:val="36"/>
       <w:szCs w:val="26"/>
     </w:rPr>
@@ -4825,8 +5023,8 @@
       <w:outlineLvl w:val="2"/>
     </w:pPr>
     <w:rPr>
-      <w:rFonts w:eastAsia="" w:cs="" w:cstheme="majorBidi" w:eastAsiaTheme="majorEastAsia"/>
-      <w:color w:themeColor="accent1" w:themeShade="7f" w:val="1F3763"/>
+      <w:rFonts w:eastAsia="" w:cs="" w:eastAsiaTheme="majorEastAsia" w:cstheme="majorBidi"/>
+      <w:color w:val="1F3763" w:themeColor="accent1" w:themeShade="7f"/>
       <w:sz w:val="28"/>
       <w:szCs w:val="24"/>
     </w:rPr>
@@ -4845,9 +5043,9 @@
     <w:uiPriority w:val="9"/>
     <w:rsid w:val="00df3b37"/>
     <w:rPr>
-      <w:rFonts w:ascii="Calibri Light" w:hAnsi="Calibri Light" w:eastAsia="" w:cs="" w:asciiTheme="majorHAnsi" w:cstheme="majorBidi" w:eastAsiaTheme="majorEastAsia" w:hAnsiTheme="majorHAnsi"/>
+      <w:rFonts w:ascii="Calibri Light" w:hAnsi="Calibri Light" w:eastAsia="" w:cs="" w:asciiTheme="majorHAnsi" w:hAnsiTheme="majorHAnsi" w:eastAsiaTheme="majorEastAsia" w:cstheme="majorBidi"/>
       <w:b/>
-      <w:color w:themeColor="accent1" w:themeShade="bf" w:val="2F5496"/>
+      <w:color w:val="2F5496" w:themeColor="accent1" w:themeShade="bf"/>
       <w:sz w:val="44"/>
       <w:szCs w:val="32"/>
     </w:rPr>
@@ -4859,8 +5057,8 @@
     <w:uiPriority w:val="9"/>
     <w:rsid w:val="007f2be0"/>
     <w:rPr>
-      <w:rFonts w:ascii="Calibri Light" w:hAnsi="Calibri Light" w:eastAsia="" w:cs="" w:asciiTheme="majorHAnsi" w:cstheme="majorBidi" w:eastAsiaTheme="majorEastAsia" w:hAnsiTheme="majorHAnsi"/>
-      <w:color w:themeColor="accent1" w:themeShade="bf" w:val="2F5496"/>
+      <w:rFonts w:ascii="Calibri Light" w:hAnsi="Calibri Light" w:eastAsia="" w:cs="" w:asciiTheme="majorHAnsi" w:hAnsiTheme="majorHAnsi" w:eastAsiaTheme="majorEastAsia" w:cstheme="majorBidi"/>
+      <w:color w:val="2F5496" w:themeColor="accent1" w:themeShade="bf"/>
       <w:sz w:val="36"/>
       <w:szCs w:val="26"/>
     </w:rPr>
@@ -4872,8 +5070,8 @@
     <w:uiPriority w:val="9"/>
     <w:rsid w:val="0007052b"/>
     <w:rPr>
-      <w:rFonts w:eastAsia="" w:cs="" w:cstheme="majorBidi" w:eastAsiaTheme="majorEastAsia"/>
-      <w:color w:themeColor="accent1" w:themeShade="7f" w:val="1F3763"/>
+      <w:rFonts w:eastAsia="" w:cs="" w:eastAsiaTheme="majorEastAsia" w:cstheme="majorBidi"/>
+      <w:color w:val="1F3763" w:themeColor="accent1" w:themeShade="7f"/>
       <w:sz w:val="28"/>
       <w:szCs w:val="24"/>
     </w:rPr>
@@ -4885,7 +5083,7 @@
     <w:uiPriority w:val="10"/>
     <w:rsid w:val="003d02c4"/>
     <w:rPr>
-      <w:rFonts w:ascii="Calibri Light" w:hAnsi="Calibri Light" w:eastAsia="" w:cs="" w:asciiTheme="majorHAnsi" w:cstheme="majorBidi" w:eastAsiaTheme="majorEastAsia" w:hAnsiTheme="majorHAnsi"/>
+      <w:rFonts w:ascii="Calibri Light" w:hAnsi="Calibri Light" w:eastAsia="" w:cs="" w:asciiTheme="majorHAnsi" w:hAnsiTheme="majorHAnsi" w:eastAsiaTheme="majorEastAsia" w:cstheme="majorBidi"/>
       <w:spacing w:val="-10"/>
       <w:kern w:val="2"/>
       <w:sz w:val="56"/>
@@ -4900,7 +5098,7 @@
     <w:rsid w:val="003d02c4"/>
     <w:rPr>
       <w:rFonts w:eastAsia="" w:eastAsiaTheme="minorEastAsia"/>
-      <w:color w:themeColor="text1" w:themeTint="a5" w:val="5A5A5A"/>
+      <w:color w:val="5A5A5A" w:themeColor="text1" w:themeTint="a5"/>
       <w:spacing w:val="15"/>
     </w:rPr>
   </w:style>
@@ -4911,7 +5109,7 @@
     <w:unhideWhenUsed/>
     <w:rsid w:val="00773c67"/>
     <w:rPr>
-      <w:color w:themeColor="hyperlink" w:val="0563C1"/>
+      <w:color w:val="0563C1" w:themeColor="hyperlink"/>
       <w:u w:val="single"/>
     </w:rPr>
   </w:style>
@@ -4939,7 +5137,7 @@
     <w:rsid w:val="005d0c04"/>
     <w:rPr>
       <w:smallCaps/>
-      <w:color w:themeColor="text1" w:themeTint="a5" w:val="5A5A5A"/>
+      <w:color w:val="5A5A5A" w:themeColor="text1" w:themeTint="a5"/>
     </w:rPr>
   </w:style>
   <w:style w:type="character" w:styleId="BookTitle">
@@ -4978,7 +5176,7 @@
     <w:name w:val="Body Text"/>
     <w:basedOn w:val="Normal"/>
     <w:pPr>
-      <w:spacing w:lineRule="auto" w:line="276" w:before="0" w:after="140"/>
+      <w:spacing w:before="0" w:after="140" w:line="276" w:lineRule="auto"/>
     </w:pPr>
     <w:rPr/>
   </w:style>
@@ -5024,11 +5222,11 @@
     <w:qFormat/>
     <w:rsid w:val="003d02c4"/>
     <w:pPr>
-      <w:spacing w:lineRule="auto" w:line="240" w:before="0" w:after="0"/>
+      <w:spacing w:before="0" w:after="0" w:line="240" w:lineRule="auto"/>
       <w:contextualSpacing/>
     </w:pPr>
     <w:rPr>
-      <w:rFonts w:ascii="Calibri Light" w:hAnsi="Calibri Light" w:eastAsia="" w:cs="" w:asciiTheme="majorHAnsi" w:cstheme="majorBidi" w:eastAsiaTheme="majorEastAsia" w:hAnsiTheme="majorHAnsi"/>
+      <w:rFonts w:ascii="Calibri Light" w:hAnsi="Calibri Light" w:eastAsia="" w:cs="" w:asciiTheme="majorHAnsi" w:hAnsiTheme="majorHAnsi" w:eastAsiaTheme="majorEastAsia" w:cstheme="majorBidi"/>
       <w:spacing w:val="-10"/>
       <w:kern w:val="2"/>
       <w:sz w:val="56"/>
@@ -5046,7 +5244,7 @@
     <w:pPr/>
     <w:rPr>
       <w:rFonts w:eastAsia="" w:eastAsiaTheme="minorEastAsia"/>
-      <w:color w:themeColor="text1" w:themeTint="a5" w:val="5A5A5A"/>
+      <w:color w:val="5A5A5A" w:themeColor="text1" w:themeTint="a5"/>
       <w:spacing w:val="15"/>
     </w:rPr>
   </w:style>
@@ -5130,10 +5328,10 @@
     <w:pPr>
       <w:tabs>
         <w:tab w:val="clear" w:pos="708"/>
-        <w:tab w:val="center" w:pos="4513" w:leader="none"/>
-        <w:tab w:val="right" w:pos="9026" w:leader="none"/>
+        <w:tab w:val="center" w:leader="none" w:pos="4513"/>
+        <w:tab w:val="right" w:leader="none" w:pos="9026"/>
       </w:tabs>
-      <w:spacing w:lineRule="auto" w:line="240" w:before="0" w:after="0"/>
+      <w:spacing w:before="0" w:after="0" w:line="240" w:lineRule="auto"/>
     </w:pPr>
     <w:rPr/>
   </w:style>
@@ -5147,10 +5345,10 @@
     <w:pPr>
       <w:tabs>
         <w:tab w:val="clear" w:pos="708"/>
-        <w:tab w:val="center" w:pos="4513" w:leader="none"/>
-        <w:tab w:val="right" w:pos="9026" w:leader="none"/>
+        <w:tab w:val="center" w:leader="none" w:pos="4513"/>
+        <w:tab w:val="right" w:leader="none" w:pos="9026"/>
       </w:tabs>
-      <w:spacing w:lineRule="auto" w:line="240" w:before="0" w:after="0"/>
+      <w:spacing w:before="0" w:after="0" w:line="240" w:lineRule="auto"/>
     </w:pPr>
     <w:rPr/>
   </w:style>
@@ -5166,7 +5364,7 @@
     <w:semiHidden/>
     <w:unhideWhenUsed/>
   </w:style>
-  <w:style w:type="table" w:default="1" w:styleId="TableNormal">
+  <w:style w:type="table" w:styleId="TableNormal" w:default="1">
     <w:name w:val="Normal Table"/>
     <w:uiPriority w:val="99"/>
     <w:semiHidden/>

</xml_diff>